<commit_message>
updated download links to include older stations
</commit_message>
<xml_diff>
--- a/chl_a_download_links.docx
+++ b/chl_a_download_links.docx
@@ -3,41 +3,1146 @@
 <w:document xmlns:wpc="http://schemas.microsoft.com/office/word/2010/wordprocessingCanvas" xmlns:cx="http://schemas.microsoft.com/office/drawing/2014/chartex" xmlns:cx1="http://schemas.microsoft.com/office/drawing/2015/9/8/chartex" xmlns:cx2="http://schemas.microsoft.com/office/drawing/2015/10/21/chartex" xmlns:cx3="http://schemas.microsoft.com/office/drawing/2016/5/9/chartex" xmlns:cx4="http://schemas.microsoft.com/office/drawing/2016/5/10/chartex" xmlns:cx5="http://schemas.microsoft.com/office/drawing/2016/5/11/chartex" xmlns:cx6="http://schemas.microsoft.com/office/drawing/2016/5/12/chartex" xmlns:cx7="http://schemas.microsoft.com/office/drawing/2016/5/13/chartex" xmlns:cx8="http://schemas.microsoft.com/office/drawing/2016/5/14/chartex" xmlns:mc="http://schemas.openxmlformats.org/markup-compatibility/2006" xmlns:aink="http://schemas.microsoft.com/office/drawing/2016/ink" xmlns:am3d="http://schemas.microsoft.com/office/drawing/2017/model3d" xmlns:o="urn:schemas-microsoft-com:office:office" xmlns:r="http://schemas.openxmlformats.org/officeDocument/2006/relationships" xmlns:m="http://schemas.openxmlformats.org/officeDocument/2006/math" xmlns:v="urn:schemas-microsoft-com:vml" xmlns:wp14="http://schemas.microsoft.com/office/word/2010/wordprocessingDrawing" xmlns:wp="http://schemas.openxmlformats.org/drawingml/2006/wordprocessingDrawing" xmlns:w10="urn:schemas-microsoft-com:office:word" xmlns:w="http://schemas.openxmlformats.org/wordprocessingml/2006/main" xmlns:w14="http://schemas.microsoft.com/office/word/2010/wordml" xmlns:w15="http://schemas.microsoft.com/office/word/2012/wordml" xmlns:w16cex="http://schemas.microsoft.com/office/word/2018/wordml/cex" xmlns:w16cid="http://schemas.microsoft.com/office/word/2016/wordml/cid" xmlns:w16="http://schemas.microsoft.com/office/word/2018/wordml" xmlns:w16se="http://schemas.microsoft.com/office/word/2015/wordml/symex" xmlns:wpg="http://schemas.microsoft.com/office/word/2010/wordprocessingGroup" xmlns:wpi="http://schemas.microsoft.com/office/word/2010/wordprocessingInk" xmlns:wne="http://schemas.microsoft.com/office/word/2006/wordml" xmlns:wps="http://schemas.microsoft.com/office/word/2010/wordprocessingShape" mc:Ignorable="w14 w15 w16se w16cid w16 w16cex wp14">
   <w:body>
     <w:p>
-      <w:pPr>
-        <w:rPr>
-          <w:rFonts w:ascii="Times" w:eastAsia="Times New Roman" w:hAnsi="Times" w:cs="Times New Roman"/>
-          <w:color w:val="000000"/>
-          <w:sz w:val="20"/>
-          <w:szCs w:val="20"/>
-          <w:lang w:val="en-CA"/>
-        </w:rPr>
-      </w:pPr>
-      <w:r>
-        <w:rPr>
-          <w:rFonts w:ascii="Times" w:eastAsia="Times New Roman" w:hAnsi="Times" w:cs="Times New Roman"/>
-          <w:color w:val="000000"/>
-          <w:sz w:val="20"/>
-          <w:szCs w:val="20"/>
-          <w:lang w:val="en-CA"/>
-        </w:rPr>
-        <w:t>SEASONAL LINKS</w:t>
-      </w:r>
-    </w:p>
-    <w:p>
-      <w:pPr>
-        <w:rPr>
-          <w:rFonts w:ascii="Times" w:eastAsia="Times New Roman" w:hAnsi="Times" w:cs="Times New Roman"/>
-          <w:color w:val="000000"/>
-          <w:sz w:val="20"/>
-          <w:szCs w:val="20"/>
-          <w:lang w:val="en-CA"/>
-        </w:rPr>
-      </w:pPr>
-    </w:p>
-    <w:p>
-      <w:pPr>
-        <w:rPr>
-          <w:rFonts w:ascii="Times New Roman" w:eastAsia="Times New Roman" w:hAnsi="Times New Roman" w:cs="Times New Roman"/>
+      <w:r>
+        <w:t>SEASONAL: CZCS 1978 - 1986</w:t>
+      </w:r>
+    </w:p>
+    <w:p>
+      <w:pPr>
+        <w:rPr>
+          <w:rFonts w:ascii="Times New Roman" w:eastAsia="Times New Roman" w:hAnsi="Times New Roman" w:cs="Times New Roman"/>
+          <w:sz w:val="20"/>
+          <w:szCs w:val="20"/>
+          <w:lang w:val="en-CA"/>
+        </w:rPr>
+      </w:pPr>
+      <w:r>
+        <w:rPr>
+          <w:rFonts w:ascii="Times New Roman" w:eastAsia="Times New Roman" w:hAnsi="Times New Roman" w:cs="Times New Roman"/>
+          <w:sz w:val="20"/>
+          <w:szCs w:val="20"/>
+          <w:lang w:val="en-CA"/>
+        </w:rPr>
+        <w:t>https://oceandata.sci.gsfc.nasa.gov/cgi/getfile/C19782641978354.L3m_SNAU_CHL_chlor_a_4km.nc</w:t>
+      </w:r>
+    </w:p>
+    <w:p>
+      <w:pPr>
+        <w:rPr>
+          <w:rFonts w:ascii="Times New Roman" w:eastAsia="Times New Roman" w:hAnsi="Times New Roman" w:cs="Times New Roman"/>
+          <w:sz w:val="20"/>
+          <w:szCs w:val="20"/>
+          <w:lang w:val="en-CA"/>
+        </w:rPr>
+      </w:pPr>
+      <w:r>
+        <w:rPr>
+          <w:rFonts w:ascii="Times New Roman" w:eastAsia="Times New Roman" w:hAnsi="Times New Roman" w:cs="Times New Roman"/>
+          <w:sz w:val="20"/>
+          <w:szCs w:val="20"/>
+          <w:lang w:val="en-CA"/>
+        </w:rPr>
+        <w:t>https://oceandata.sci.gsfc.nasa.gov/cgi/getfile/C19783551979079.L3m_SNWI_CHL_chlor_a_4km.nc</w:t>
+      </w:r>
+    </w:p>
+    <w:p>
+      <w:pPr>
+        <w:rPr>
+          <w:rFonts w:ascii="Times New Roman" w:eastAsia="Times New Roman" w:hAnsi="Times New Roman" w:cs="Times New Roman"/>
+          <w:sz w:val="20"/>
+          <w:szCs w:val="20"/>
+          <w:lang w:val="en-CA"/>
+        </w:rPr>
+      </w:pPr>
+      <w:r>
+        <w:rPr>
+          <w:rFonts w:ascii="Times New Roman" w:eastAsia="Times New Roman" w:hAnsi="Times New Roman" w:cs="Times New Roman"/>
+          <w:sz w:val="20"/>
+          <w:szCs w:val="20"/>
+          <w:lang w:val="en-CA"/>
+        </w:rPr>
+        <w:t>https://oceandata.sci.gsfc.nasa.gov/cgi/getfile/C19790801979171.L3m_SNSP_CHL_chlor_a_4km.nc</w:t>
+      </w:r>
+    </w:p>
+    <w:p>
+      <w:pPr>
+        <w:rPr>
+          <w:rFonts w:ascii="Times New Roman" w:eastAsia="Times New Roman" w:hAnsi="Times New Roman" w:cs="Times New Roman"/>
+          <w:sz w:val="20"/>
+          <w:szCs w:val="20"/>
+          <w:lang w:val="en-CA"/>
+        </w:rPr>
+      </w:pPr>
+      <w:r>
+        <w:rPr>
+          <w:rFonts w:ascii="Times New Roman" w:eastAsia="Times New Roman" w:hAnsi="Times New Roman" w:cs="Times New Roman"/>
+          <w:sz w:val="20"/>
+          <w:szCs w:val="20"/>
+          <w:lang w:val="en-CA"/>
+        </w:rPr>
+        <w:t>https://oceandata.sci.gsfc.nasa.gov/cgi/getfile/C19791721979263.L3m_SNSU_CHL_chlor_a_4km.nc</w:t>
+      </w:r>
+    </w:p>
+    <w:p>
+      <w:pPr>
+        <w:rPr>
+          <w:rFonts w:ascii="Times New Roman" w:eastAsia="Times New Roman" w:hAnsi="Times New Roman" w:cs="Times New Roman"/>
+          <w:sz w:val="20"/>
+          <w:szCs w:val="20"/>
+          <w:lang w:val="en-CA"/>
+        </w:rPr>
+      </w:pPr>
+      <w:r>
+        <w:rPr>
+          <w:rFonts w:ascii="Times New Roman" w:eastAsia="Times New Roman" w:hAnsi="Times New Roman" w:cs="Times New Roman"/>
+          <w:sz w:val="20"/>
+          <w:szCs w:val="20"/>
+          <w:lang w:val="en-CA"/>
+        </w:rPr>
+        <w:t>https://oceandata.sci.gsfc.nasa.gov/cgi/getfile/C19792641979354.L3m_SNAU_CHL_chlor_a_4km.nc</w:t>
+      </w:r>
+    </w:p>
+    <w:p>
+      <w:pPr>
+        <w:rPr>
+          <w:rFonts w:ascii="Times New Roman" w:eastAsia="Times New Roman" w:hAnsi="Times New Roman" w:cs="Times New Roman"/>
+          <w:sz w:val="20"/>
+          <w:szCs w:val="20"/>
+          <w:lang w:val="en-CA"/>
+        </w:rPr>
+      </w:pPr>
+      <w:r>
+        <w:rPr>
+          <w:rFonts w:ascii="Times New Roman" w:eastAsia="Times New Roman" w:hAnsi="Times New Roman" w:cs="Times New Roman"/>
+          <w:sz w:val="20"/>
+          <w:szCs w:val="20"/>
+          <w:lang w:val="en-CA"/>
+        </w:rPr>
+        <w:t>https://oceandata.sci.gsfc.nasa.gov/cgi/getfile/C19793551980080.L3m_SNWI_CHL_chlor_a_4km.nc</w:t>
+      </w:r>
+    </w:p>
+    <w:p>
+      <w:pPr>
+        <w:rPr>
+          <w:rFonts w:ascii="Times New Roman" w:eastAsia="Times New Roman" w:hAnsi="Times New Roman" w:cs="Times New Roman"/>
+          <w:sz w:val="20"/>
+          <w:szCs w:val="20"/>
+          <w:lang w:val="en-CA"/>
+        </w:rPr>
+      </w:pPr>
+      <w:r>
+        <w:rPr>
+          <w:rFonts w:ascii="Times New Roman" w:eastAsia="Times New Roman" w:hAnsi="Times New Roman" w:cs="Times New Roman"/>
+          <w:sz w:val="20"/>
+          <w:szCs w:val="20"/>
+          <w:lang w:val="en-CA"/>
+        </w:rPr>
+        <w:t>https://oceandata.sci.gsfc.nasa.gov/cgi/getfile/C19800811980172.L3m_SNSP_CHL_chlor_a_4km.nc</w:t>
+      </w:r>
+    </w:p>
+    <w:p>
+      <w:pPr>
+        <w:rPr>
+          <w:rFonts w:ascii="Times New Roman" w:eastAsia="Times New Roman" w:hAnsi="Times New Roman" w:cs="Times New Roman"/>
+          <w:sz w:val="20"/>
+          <w:szCs w:val="20"/>
+          <w:lang w:val="en-CA"/>
+        </w:rPr>
+      </w:pPr>
+      <w:r>
+        <w:rPr>
+          <w:rFonts w:ascii="Times New Roman" w:eastAsia="Times New Roman" w:hAnsi="Times New Roman" w:cs="Times New Roman"/>
+          <w:sz w:val="20"/>
+          <w:szCs w:val="20"/>
+          <w:lang w:val="en-CA"/>
+        </w:rPr>
+        <w:t>https://oceandata.sci.gsfc.nasa.gov/cgi/getfile/C19801731980264.L3m_SNSU_CHL_chlor_a_4km.nc</w:t>
+      </w:r>
+    </w:p>
+    <w:p>
+      <w:pPr>
+        <w:rPr>
+          <w:rFonts w:ascii="Times New Roman" w:eastAsia="Times New Roman" w:hAnsi="Times New Roman" w:cs="Times New Roman"/>
+          <w:sz w:val="20"/>
+          <w:szCs w:val="20"/>
+          <w:lang w:val="en-CA"/>
+        </w:rPr>
+      </w:pPr>
+      <w:r>
+        <w:rPr>
+          <w:rFonts w:ascii="Times New Roman" w:eastAsia="Times New Roman" w:hAnsi="Times New Roman" w:cs="Times New Roman"/>
+          <w:sz w:val="20"/>
+          <w:szCs w:val="20"/>
+          <w:lang w:val="en-CA"/>
+        </w:rPr>
+        <w:t>https://oceandata.sci.gsfc.nasa.gov/cgi/getfile/C19802651980355.L3m_SNAU_CHL_chlor_a_4km.nc</w:t>
+      </w:r>
+    </w:p>
+    <w:p>
+      <w:pPr>
+        <w:rPr>
+          <w:rFonts w:ascii="Times New Roman" w:eastAsia="Times New Roman" w:hAnsi="Times New Roman" w:cs="Times New Roman"/>
+          <w:sz w:val="20"/>
+          <w:szCs w:val="20"/>
+          <w:lang w:val="en-CA"/>
+        </w:rPr>
+      </w:pPr>
+      <w:r>
+        <w:rPr>
+          <w:rFonts w:ascii="Times New Roman" w:eastAsia="Times New Roman" w:hAnsi="Times New Roman" w:cs="Times New Roman"/>
+          <w:sz w:val="20"/>
+          <w:szCs w:val="20"/>
+          <w:lang w:val="en-CA"/>
+        </w:rPr>
+        <w:t>https://oceandata.sci.gsfc.nasa.gov/cgi/getfile/C19803561981079.L3m_SNWI_CHL_chlor_a_4km.nc</w:t>
+      </w:r>
+    </w:p>
+    <w:p>
+      <w:pPr>
+        <w:rPr>
+          <w:rFonts w:ascii="Times New Roman" w:eastAsia="Times New Roman" w:hAnsi="Times New Roman" w:cs="Times New Roman"/>
+          <w:sz w:val="20"/>
+          <w:szCs w:val="20"/>
+          <w:lang w:val="en-CA"/>
+        </w:rPr>
+      </w:pPr>
+      <w:r>
+        <w:rPr>
+          <w:rFonts w:ascii="Times New Roman" w:eastAsia="Times New Roman" w:hAnsi="Times New Roman" w:cs="Times New Roman"/>
+          <w:sz w:val="20"/>
+          <w:szCs w:val="20"/>
+          <w:lang w:val="en-CA"/>
+        </w:rPr>
+        <w:t>https://oceandata.sci.gsfc.nasa.gov/cgi/getfile/C19810801981171.L3m_SNSP_CHL_chlor_a_4km.nc</w:t>
+      </w:r>
+    </w:p>
+    <w:p>
+      <w:pPr>
+        <w:rPr>
+          <w:rFonts w:ascii="Times New Roman" w:eastAsia="Times New Roman" w:hAnsi="Times New Roman" w:cs="Times New Roman"/>
+          <w:sz w:val="20"/>
+          <w:szCs w:val="20"/>
+          <w:lang w:val="en-CA"/>
+        </w:rPr>
+      </w:pPr>
+      <w:r>
+        <w:rPr>
+          <w:rFonts w:ascii="Times New Roman" w:eastAsia="Times New Roman" w:hAnsi="Times New Roman" w:cs="Times New Roman"/>
+          <w:sz w:val="20"/>
+          <w:szCs w:val="20"/>
+          <w:lang w:val="en-CA"/>
+        </w:rPr>
+        <w:t>https://oceandata.sci.gsfc.nasa.gov/cgi/getfile/C19811721981263.L3m_SNSU_CHL_chlor_a_4km.nc</w:t>
+      </w:r>
+    </w:p>
+    <w:p>
+      <w:pPr>
+        <w:rPr>
+          <w:rFonts w:ascii="Times New Roman" w:eastAsia="Times New Roman" w:hAnsi="Times New Roman" w:cs="Times New Roman"/>
+          <w:sz w:val="20"/>
+          <w:szCs w:val="20"/>
+          <w:lang w:val="en-CA"/>
+        </w:rPr>
+      </w:pPr>
+      <w:r>
+        <w:rPr>
+          <w:rFonts w:ascii="Times New Roman" w:eastAsia="Times New Roman" w:hAnsi="Times New Roman" w:cs="Times New Roman"/>
+          <w:sz w:val="20"/>
+          <w:szCs w:val="20"/>
+          <w:lang w:val="en-CA"/>
+        </w:rPr>
+        <w:t>https://oceandata.sci.gsfc.nasa.gov/cgi/getfile/C19812641981354.L3m_SNAU_CHL_chlor_a_4km.nc</w:t>
+      </w:r>
+    </w:p>
+    <w:p>
+      <w:pPr>
+        <w:rPr>
+          <w:rFonts w:ascii="Times New Roman" w:eastAsia="Times New Roman" w:hAnsi="Times New Roman" w:cs="Times New Roman"/>
+          <w:sz w:val="20"/>
+          <w:szCs w:val="20"/>
+          <w:lang w:val="en-CA"/>
+        </w:rPr>
+      </w:pPr>
+      <w:r>
+        <w:rPr>
+          <w:rFonts w:ascii="Times New Roman" w:eastAsia="Times New Roman" w:hAnsi="Times New Roman" w:cs="Times New Roman"/>
+          <w:sz w:val="20"/>
+          <w:szCs w:val="20"/>
+          <w:lang w:val="en-CA"/>
+        </w:rPr>
+        <w:t>https://oceandata.sci.gsfc.nasa.gov/cgi/getfile/C19813551982079.L3m_SNWI_CHL_chlor_a_4km.nc</w:t>
+      </w:r>
+    </w:p>
+    <w:p>
+      <w:pPr>
+        <w:rPr>
+          <w:rFonts w:ascii="Times New Roman" w:eastAsia="Times New Roman" w:hAnsi="Times New Roman" w:cs="Times New Roman"/>
+          <w:sz w:val="20"/>
+          <w:szCs w:val="20"/>
+          <w:lang w:val="en-CA"/>
+        </w:rPr>
+      </w:pPr>
+      <w:r>
+        <w:rPr>
+          <w:rFonts w:ascii="Times New Roman" w:eastAsia="Times New Roman" w:hAnsi="Times New Roman" w:cs="Times New Roman"/>
+          <w:sz w:val="20"/>
+          <w:szCs w:val="20"/>
+          <w:lang w:val="en-CA"/>
+        </w:rPr>
+        <w:t>https://oceandata.sci.gsfc.nasa.gov/cgi/getfile/C19821721982263.L3m_SNSU_CHL_chlor_a_4km.nc</w:t>
+      </w:r>
+    </w:p>
+    <w:p>
+      <w:pPr>
+        <w:rPr>
+          <w:rFonts w:ascii="Times New Roman" w:eastAsia="Times New Roman" w:hAnsi="Times New Roman" w:cs="Times New Roman"/>
+          <w:sz w:val="20"/>
+          <w:szCs w:val="20"/>
+          <w:lang w:val="en-CA"/>
+        </w:rPr>
+      </w:pPr>
+      <w:r>
+        <w:rPr>
+          <w:rFonts w:ascii="Times New Roman" w:eastAsia="Times New Roman" w:hAnsi="Times New Roman" w:cs="Times New Roman"/>
+          <w:sz w:val="20"/>
+          <w:szCs w:val="20"/>
+          <w:lang w:val="en-CA"/>
+        </w:rPr>
+        <w:t>https://oceandata.sci.gsfc.nasa.gov/cgi/getfile/C19822641982354.L3m_SNAU_CHL_chlor_a_4km.nc</w:t>
+      </w:r>
+    </w:p>
+    <w:p>
+      <w:pPr>
+        <w:rPr>
+          <w:rFonts w:ascii="Times New Roman" w:eastAsia="Times New Roman" w:hAnsi="Times New Roman" w:cs="Times New Roman"/>
+          <w:sz w:val="20"/>
+          <w:szCs w:val="20"/>
+          <w:lang w:val="en-CA"/>
+        </w:rPr>
+      </w:pPr>
+      <w:r>
+        <w:rPr>
+          <w:rFonts w:ascii="Times New Roman" w:eastAsia="Times New Roman" w:hAnsi="Times New Roman" w:cs="Times New Roman"/>
+          <w:sz w:val="20"/>
+          <w:szCs w:val="20"/>
+          <w:lang w:val="en-CA"/>
+        </w:rPr>
+        <w:t>https://oceandata.sci.gsfc.nasa.gov/cgi/getfile/C19823551983079.L3m_SNWI_CHL_chlor_a_4km.nc</w:t>
+      </w:r>
+    </w:p>
+    <w:p>
+      <w:pPr>
+        <w:rPr>
+          <w:rFonts w:ascii="Times New Roman" w:eastAsia="Times New Roman" w:hAnsi="Times New Roman" w:cs="Times New Roman"/>
+          <w:sz w:val="20"/>
+          <w:szCs w:val="20"/>
+          <w:lang w:val="en-CA"/>
+        </w:rPr>
+      </w:pPr>
+      <w:r>
+        <w:rPr>
+          <w:rFonts w:ascii="Times New Roman" w:eastAsia="Times New Roman" w:hAnsi="Times New Roman" w:cs="Times New Roman"/>
+          <w:sz w:val="20"/>
+          <w:szCs w:val="20"/>
+          <w:lang w:val="en-CA"/>
+        </w:rPr>
+        <w:t>https://oceandata.sci.gsfc.nasa.gov/cgi/getfile/C19830801983171.L3m_SNSP_CHL_chlor_a_4km.nc</w:t>
+      </w:r>
+    </w:p>
+    <w:p>
+      <w:pPr>
+        <w:rPr>
+          <w:rFonts w:ascii="Times New Roman" w:eastAsia="Times New Roman" w:hAnsi="Times New Roman" w:cs="Times New Roman"/>
+          <w:sz w:val="20"/>
+          <w:szCs w:val="20"/>
+          <w:lang w:val="en-CA"/>
+        </w:rPr>
+      </w:pPr>
+      <w:r>
+        <w:rPr>
+          <w:rFonts w:ascii="Times New Roman" w:eastAsia="Times New Roman" w:hAnsi="Times New Roman" w:cs="Times New Roman"/>
+          <w:sz w:val="20"/>
+          <w:szCs w:val="20"/>
+          <w:lang w:val="en-CA"/>
+        </w:rPr>
+        <w:t>https://oceandata.sci.gsfc.nasa.gov/cgi/getfile/C19831721983263.L3m_SNSU_CHL_chlor_a_4km.nc</w:t>
+      </w:r>
+    </w:p>
+    <w:p>
+      <w:pPr>
+        <w:rPr>
+          <w:rFonts w:ascii="Times New Roman" w:eastAsia="Times New Roman" w:hAnsi="Times New Roman" w:cs="Times New Roman"/>
+          <w:sz w:val="20"/>
+          <w:szCs w:val="20"/>
+          <w:lang w:val="en-CA"/>
+        </w:rPr>
+      </w:pPr>
+      <w:r>
+        <w:rPr>
+          <w:rFonts w:ascii="Times New Roman" w:eastAsia="Times New Roman" w:hAnsi="Times New Roman" w:cs="Times New Roman"/>
+          <w:sz w:val="20"/>
+          <w:szCs w:val="20"/>
+          <w:lang w:val="en-CA"/>
+        </w:rPr>
+        <w:t>https://oceandata.sci.gsfc.nasa.gov/cgi/getfile/C19832641983354.L3m_SNAU_CHL_chlor_a_4km.nc</w:t>
+      </w:r>
+    </w:p>
+    <w:p>
+      <w:pPr>
+        <w:rPr>
+          <w:rFonts w:ascii="Times New Roman" w:eastAsia="Times New Roman" w:hAnsi="Times New Roman" w:cs="Times New Roman"/>
+          <w:sz w:val="20"/>
+          <w:szCs w:val="20"/>
+          <w:lang w:val="en-CA"/>
+        </w:rPr>
+      </w:pPr>
+      <w:r>
+        <w:rPr>
+          <w:rFonts w:ascii="Times New Roman" w:eastAsia="Times New Roman" w:hAnsi="Times New Roman" w:cs="Times New Roman"/>
+          <w:sz w:val="20"/>
+          <w:szCs w:val="20"/>
+          <w:lang w:val="en-CA"/>
+        </w:rPr>
+        <w:t>https://oceandata.sci.gsfc.nasa.gov/cgi/getfile/C19833551984080.L3m_SNWI_CHL_chlor_a_4km.nc</w:t>
+      </w:r>
+    </w:p>
+    <w:p>
+      <w:pPr>
+        <w:rPr>
+          <w:rFonts w:ascii="Times New Roman" w:eastAsia="Times New Roman" w:hAnsi="Times New Roman" w:cs="Times New Roman"/>
+          <w:sz w:val="20"/>
+          <w:szCs w:val="20"/>
+          <w:lang w:val="en-CA"/>
+        </w:rPr>
+      </w:pPr>
+      <w:r>
+        <w:rPr>
+          <w:rFonts w:ascii="Times New Roman" w:eastAsia="Times New Roman" w:hAnsi="Times New Roman" w:cs="Times New Roman"/>
+          <w:sz w:val="20"/>
+          <w:szCs w:val="20"/>
+          <w:lang w:val="en-CA"/>
+        </w:rPr>
+        <w:t>https://oceandata.sci.gsfc.nasa.gov/cgi/getfile/C19840811984172.L3m_SNSP_CHL_chlor_a_4km.nc</w:t>
+      </w:r>
+    </w:p>
+    <w:p>
+      <w:pPr>
+        <w:rPr>
+          <w:rFonts w:ascii="Times New Roman" w:eastAsia="Times New Roman" w:hAnsi="Times New Roman" w:cs="Times New Roman"/>
+          <w:sz w:val="20"/>
+          <w:szCs w:val="20"/>
+          <w:lang w:val="en-CA"/>
+        </w:rPr>
+      </w:pPr>
+      <w:r>
+        <w:rPr>
+          <w:rFonts w:ascii="Times New Roman" w:eastAsia="Times New Roman" w:hAnsi="Times New Roman" w:cs="Times New Roman"/>
+          <w:sz w:val="20"/>
+          <w:szCs w:val="20"/>
+          <w:lang w:val="en-CA"/>
+        </w:rPr>
+        <w:t>https://oceandata.sci.gsfc.nasa.gov/cgi/getfile/C19841731984264.L3m_SNSU_CHL_chlor_a_4km.nc</w:t>
+      </w:r>
+    </w:p>
+    <w:p>
+      <w:pPr>
+        <w:rPr>
+          <w:rFonts w:ascii="Times New Roman" w:eastAsia="Times New Roman" w:hAnsi="Times New Roman" w:cs="Times New Roman"/>
+          <w:sz w:val="20"/>
+          <w:szCs w:val="20"/>
+          <w:lang w:val="en-CA"/>
+        </w:rPr>
+      </w:pPr>
+      <w:r>
+        <w:rPr>
+          <w:rFonts w:ascii="Times New Roman" w:eastAsia="Times New Roman" w:hAnsi="Times New Roman" w:cs="Times New Roman"/>
+          <w:sz w:val="20"/>
+          <w:szCs w:val="20"/>
+          <w:lang w:val="en-CA"/>
+        </w:rPr>
+        <w:t>https://oceandata.sci.gsfc.nasa.gov/cgi/getfile/C19842651984355.L3m_SNAU_CHL_chlor_a_4km.nc</w:t>
+      </w:r>
+    </w:p>
+    <w:p>
+      <w:pPr>
+        <w:rPr>
+          <w:rFonts w:ascii="Times New Roman" w:eastAsia="Times New Roman" w:hAnsi="Times New Roman" w:cs="Times New Roman"/>
+          <w:sz w:val="20"/>
+          <w:szCs w:val="20"/>
+          <w:lang w:val="en-CA"/>
+        </w:rPr>
+      </w:pPr>
+      <w:r>
+        <w:rPr>
+          <w:rFonts w:ascii="Times New Roman" w:eastAsia="Times New Roman" w:hAnsi="Times New Roman" w:cs="Times New Roman"/>
+          <w:sz w:val="20"/>
+          <w:szCs w:val="20"/>
+          <w:lang w:val="en-CA"/>
+        </w:rPr>
+        <w:t>https://oceandata.sci.gsfc.nasa.gov/cgi/getfile/C19843561985079.L3m_SNWI_CHL_chlor_a_4km.nc</w:t>
+      </w:r>
+    </w:p>
+    <w:p>
+      <w:pPr>
+        <w:rPr>
+          <w:rFonts w:ascii="Times New Roman" w:eastAsia="Times New Roman" w:hAnsi="Times New Roman" w:cs="Times New Roman"/>
+          <w:sz w:val="20"/>
+          <w:szCs w:val="20"/>
+          <w:lang w:val="en-CA"/>
+        </w:rPr>
+      </w:pPr>
+      <w:r>
+        <w:rPr>
+          <w:rFonts w:ascii="Times New Roman" w:eastAsia="Times New Roman" w:hAnsi="Times New Roman" w:cs="Times New Roman"/>
+          <w:sz w:val="20"/>
+          <w:szCs w:val="20"/>
+          <w:lang w:val="en-CA"/>
+        </w:rPr>
+        <w:t>https://oceandata.sci.gsfc.nasa.gov/cgi/getfile/C19850801985171.L3m_SNSP_CHL_chlor_a_4km.nc</w:t>
+      </w:r>
+    </w:p>
+    <w:p>
+      <w:pPr>
+        <w:rPr>
+          <w:rFonts w:ascii="Times New Roman" w:eastAsia="Times New Roman" w:hAnsi="Times New Roman" w:cs="Times New Roman"/>
+          <w:sz w:val="20"/>
+          <w:szCs w:val="20"/>
+          <w:lang w:val="en-CA"/>
+        </w:rPr>
+      </w:pPr>
+      <w:r>
+        <w:rPr>
+          <w:rFonts w:ascii="Times New Roman" w:eastAsia="Times New Roman" w:hAnsi="Times New Roman" w:cs="Times New Roman"/>
+          <w:sz w:val="20"/>
+          <w:szCs w:val="20"/>
+          <w:lang w:val="en-CA"/>
+        </w:rPr>
+        <w:t>https://oceandata.sci.gsfc.nasa.gov/cgi/getfile/C19851721985263.L3m_SNSU_CHL_chlor_a_4km.nc</w:t>
+      </w:r>
+    </w:p>
+    <w:p>
+      <w:pPr>
+        <w:rPr>
+          <w:rFonts w:ascii="Times New Roman" w:eastAsia="Times New Roman" w:hAnsi="Times New Roman" w:cs="Times New Roman"/>
+          <w:sz w:val="20"/>
+          <w:szCs w:val="20"/>
+          <w:lang w:val="en-CA"/>
+        </w:rPr>
+      </w:pPr>
+      <w:r>
+        <w:rPr>
+          <w:rFonts w:ascii="Times New Roman" w:eastAsia="Times New Roman" w:hAnsi="Times New Roman" w:cs="Times New Roman"/>
+          <w:sz w:val="20"/>
+          <w:szCs w:val="20"/>
+          <w:lang w:val="en-CA"/>
+        </w:rPr>
+        <w:t>https://oceandata.sci.gsfc.nasa.gov/cgi/getfile/C19852641985354.L3m_SNAU_CHL_chlor_a_4km.nc</w:t>
+      </w:r>
+    </w:p>
+    <w:p>
+      <w:pPr>
+        <w:rPr>
+          <w:rFonts w:ascii="Times New Roman" w:eastAsia="Times New Roman" w:hAnsi="Times New Roman" w:cs="Times New Roman"/>
+          <w:sz w:val="20"/>
+          <w:szCs w:val="20"/>
+          <w:lang w:val="en-CA"/>
+        </w:rPr>
+      </w:pPr>
+      <w:r>
+        <w:rPr>
+          <w:rFonts w:ascii="Times New Roman" w:eastAsia="Times New Roman" w:hAnsi="Times New Roman" w:cs="Times New Roman"/>
+          <w:sz w:val="20"/>
+          <w:szCs w:val="20"/>
+          <w:lang w:val="en-CA"/>
+        </w:rPr>
+        <w:t>https://oceandata.sci.gsfc.nasa.gov/cgi/getfile/C19853551986079.L3m_SNWI_CHL_chlor_a_4km.nc</w:t>
+      </w:r>
+    </w:p>
+    <w:p>
+      <w:pPr>
+        <w:rPr>
+          <w:rFonts w:ascii="Times New Roman" w:eastAsia="Times New Roman" w:hAnsi="Times New Roman" w:cs="Times New Roman"/>
+          <w:sz w:val="20"/>
+          <w:szCs w:val="20"/>
+          <w:lang w:val="en-CA"/>
+        </w:rPr>
+      </w:pPr>
+      <w:r>
+        <w:rPr>
+          <w:rFonts w:ascii="Times New Roman" w:eastAsia="Times New Roman" w:hAnsi="Times New Roman" w:cs="Times New Roman"/>
+          <w:sz w:val="20"/>
+          <w:szCs w:val="20"/>
+          <w:lang w:val="en-CA"/>
+        </w:rPr>
+        <w:t>https://oceandata.sci.gsfc.nasa.gov/cgi/getfile/C19860801986171.L3m_SNSP_CHL_chlor_a_4km.nc</w:t>
+      </w:r>
+    </w:p>
+    <w:p>
+      <w:r>
+        <w:rPr>
+          <w:rFonts w:ascii="Times New Roman" w:eastAsia="Times New Roman" w:hAnsi="Times New Roman" w:cs="Times New Roman"/>
+          <w:sz w:val="20"/>
+          <w:szCs w:val="20"/>
+          <w:lang w:val="en-CA"/>
+        </w:rPr>
+        <w:t>https://oceandata.sci.gsfc.nasa.gov/cgi/getfile/C19861721986263.L3m_SNSU_CHL_chlor_a_4km.nc</w:t>
+      </w:r>
+    </w:p>
+    <w:p/>
+    <w:p>
+      <w:pPr>
+        <w:rPr>
+          <w:rFonts w:ascii="Times New Roman" w:eastAsia="Times New Roman" w:hAnsi="Times New Roman" w:cs="Times New Roman"/>
+          <w:b/>
+          <w:bCs/>
+          <w:sz w:val="20"/>
+          <w:szCs w:val="20"/>
+          <w:lang w:val="en-CA"/>
+        </w:rPr>
+      </w:pPr>
+      <w:r>
+        <w:rPr>
+          <w:rFonts w:ascii="Times New Roman" w:eastAsia="Times New Roman" w:hAnsi="Times New Roman" w:cs="Times New Roman"/>
+          <w:b/>
+          <w:bCs/>
+          <w:sz w:val="20"/>
+          <w:szCs w:val="20"/>
+          <w:lang w:val="en-CA"/>
+        </w:rPr>
+        <w:t>SEASONAL LINKS: OCTS 1996-1997</w:t>
+      </w:r>
+    </w:p>
+    <w:p>
+      <w:pPr>
+        <w:rPr>
+          <w:rFonts w:ascii="Times New Roman" w:eastAsia="Times New Roman" w:hAnsi="Times New Roman" w:cs="Times New Roman"/>
+          <w:sz w:val="20"/>
+          <w:szCs w:val="20"/>
+          <w:lang w:val="en-CA"/>
+        </w:rPr>
+      </w:pPr>
+      <w:r>
+        <w:rPr>
+          <w:rFonts w:ascii="Times New Roman" w:eastAsia="Times New Roman" w:hAnsi="Times New Roman" w:cs="Times New Roman"/>
+          <w:sz w:val="20"/>
+          <w:szCs w:val="20"/>
+          <w:lang w:val="en-CA"/>
+        </w:rPr>
+        <w:t>https://oceandata.sci.gsfc.nasa.gov/cgi/getfile/O19962651996355.L3m_SNAU_CHL_chlor_a_9km.nc</w:t>
+      </w:r>
+      <w:r>
+        <w:rPr>
+          <w:rFonts w:ascii="Times New Roman" w:eastAsia="Times New Roman" w:hAnsi="Times New Roman" w:cs="Times New Roman"/>
+          <w:sz w:val="20"/>
+          <w:szCs w:val="20"/>
+          <w:lang w:val="en-CA"/>
+        </w:rPr>
+        <w:br/>
+        <w:t>https://oceandata.sci.gsfc.nasa.gov/cgi/getfile/O19963561997079.L3m_SNWI_CHL_chlor_a_9km.nc</w:t>
+      </w:r>
+      <w:r>
+        <w:rPr>
+          <w:rFonts w:ascii="Times New Roman" w:eastAsia="Times New Roman" w:hAnsi="Times New Roman" w:cs="Times New Roman"/>
+          <w:sz w:val="20"/>
+          <w:szCs w:val="20"/>
+          <w:lang w:val="en-CA"/>
+        </w:rPr>
+        <w:br/>
+        <w:t>https://oceandata.sci.gsfc.nasa.gov/cgi/getfile/O19970801997171.L3m_SNSP_CHL_chlor_a_9km.nc</w:t>
+      </w:r>
+    </w:p>
+    <w:p>
+      <w:pPr>
+        <w:rPr>
+          <w:rFonts w:ascii="Times New Roman" w:eastAsia="Times New Roman" w:hAnsi="Times New Roman" w:cs="Times New Roman"/>
+          <w:sz w:val="20"/>
+          <w:szCs w:val="20"/>
+          <w:lang w:val="en-CA"/>
+        </w:rPr>
+      </w:pPr>
+    </w:p>
+    <w:p>
+      <w:pPr>
+        <w:rPr>
+          <w:rFonts w:ascii="Times New Roman" w:eastAsia="Times New Roman" w:hAnsi="Times New Roman" w:cs="Times New Roman"/>
+          <w:b/>
+          <w:bCs/>
+          <w:sz w:val="20"/>
+          <w:szCs w:val="20"/>
+          <w:lang w:val="en-CA"/>
+        </w:rPr>
+      </w:pPr>
+      <w:r>
+        <w:rPr>
+          <w:rFonts w:ascii="Times New Roman" w:eastAsia="Times New Roman" w:hAnsi="Times New Roman" w:cs="Times New Roman"/>
+          <w:b/>
+          <w:bCs/>
+          <w:sz w:val="20"/>
+          <w:szCs w:val="20"/>
+          <w:lang w:val="en-CA"/>
+        </w:rPr>
+        <w:t xml:space="preserve">SEASONAL LINKS: </w:t>
+      </w:r>
+      <w:proofErr w:type="spellStart"/>
+      <w:r>
+        <w:rPr>
+          <w:rFonts w:ascii="Times New Roman" w:eastAsia="Times New Roman" w:hAnsi="Times New Roman" w:cs="Times New Roman"/>
+          <w:b/>
+          <w:bCs/>
+          <w:sz w:val="20"/>
+          <w:szCs w:val="20"/>
+          <w:lang w:val="en-CA"/>
+        </w:rPr>
+        <w:t>SeaWiFS</w:t>
+      </w:r>
+      <w:proofErr w:type="spellEnd"/>
+      <w:r>
+        <w:rPr>
+          <w:rFonts w:ascii="Times New Roman" w:eastAsia="Times New Roman" w:hAnsi="Times New Roman" w:cs="Times New Roman"/>
+          <w:b/>
+          <w:bCs/>
+          <w:sz w:val="20"/>
+          <w:szCs w:val="20"/>
+          <w:lang w:val="en-CA"/>
+        </w:rPr>
+        <w:t xml:space="preserve"> 1997</w:t>
+      </w:r>
+      <w:r>
+        <w:rPr>
+          <w:rFonts w:ascii="Times New Roman" w:eastAsia="Times New Roman" w:hAnsi="Times New Roman" w:cs="Times New Roman"/>
+          <w:b/>
+          <w:bCs/>
+          <w:sz w:val="20"/>
+          <w:szCs w:val="20"/>
+          <w:lang w:val="en-CA"/>
+        </w:rPr>
+        <w:t>-2002</w:t>
+      </w:r>
+    </w:p>
+    <w:p>
+      <w:pPr>
+        <w:rPr>
+          <w:rFonts w:ascii="Times New Roman" w:eastAsia="Times New Roman" w:hAnsi="Times New Roman" w:cs="Times New Roman"/>
+          <w:sz w:val="20"/>
+          <w:szCs w:val="20"/>
+          <w:lang w:val="en-CA"/>
+        </w:rPr>
+      </w:pPr>
+      <w:r>
+        <w:rPr>
+          <w:rFonts w:ascii="Times New Roman" w:eastAsia="Times New Roman" w:hAnsi="Times New Roman" w:cs="Times New Roman"/>
+          <w:sz w:val="20"/>
+          <w:szCs w:val="20"/>
+          <w:lang w:val="en-CA"/>
+        </w:rPr>
+        <w:t>https://oceandata.sci.gsfc.nasa.gov/cgi/getfile/S19971721997263.L3m_SNSU_CHL_chlor_a_9km.nc</w:t>
+      </w:r>
+    </w:p>
+    <w:p>
+      <w:pPr>
+        <w:rPr>
+          <w:rFonts w:ascii="Times New Roman" w:eastAsia="Times New Roman" w:hAnsi="Times New Roman" w:cs="Times New Roman"/>
+          <w:sz w:val="20"/>
+          <w:szCs w:val="20"/>
+          <w:lang w:val="en-CA"/>
+        </w:rPr>
+      </w:pPr>
+      <w:r>
+        <w:rPr>
+          <w:rFonts w:ascii="Times New Roman" w:eastAsia="Times New Roman" w:hAnsi="Times New Roman" w:cs="Times New Roman"/>
+          <w:sz w:val="20"/>
+          <w:szCs w:val="20"/>
+          <w:lang w:val="en-CA"/>
+        </w:rPr>
+        <w:t>https://oceandata.sci.gsfc.nasa.gov/cgi/getfile/S19972641997354.L3m_SNAU_CHL_chlor_a_9km.nc</w:t>
+      </w:r>
+    </w:p>
+    <w:p>
+      <w:pPr>
+        <w:rPr>
+          <w:rFonts w:ascii="Times New Roman" w:eastAsia="Times New Roman" w:hAnsi="Times New Roman" w:cs="Times New Roman"/>
+          <w:sz w:val="20"/>
+          <w:szCs w:val="20"/>
+          <w:lang w:val="en-CA"/>
+        </w:rPr>
+      </w:pPr>
+      <w:r>
+        <w:rPr>
+          <w:rFonts w:ascii="Times New Roman" w:eastAsia="Times New Roman" w:hAnsi="Times New Roman" w:cs="Times New Roman"/>
+          <w:sz w:val="20"/>
+          <w:szCs w:val="20"/>
+          <w:lang w:val="en-CA"/>
+        </w:rPr>
+        <w:t>https://oceandata.sci.gsfc.nasa.gov/cgi/getfile/S19973551998079.L3m_SNWI_CHL_chlor_a_9km.nc</w:t>
+      </w:r>
+    </w:p>
+    <w:p>
+      <w:pPr>
+        <w:rPr>
+          <w:rFonts w:ascii="Times New Roman" w:eastAsia="Times New Roman" w:hAnsi="Times New Roman" w:cs="Times New Roman"/>
+          <w:sz w:val="20"/>
+          <w:szCs w:val="20"/>
+          <w:lang w:val="en-CA"/>
+        </w:rPr>
+      </w:pPr>
+      <w:r>
+        <w:rPr>
+          <w:rFonts w:ascii="Times New Roman" w:eastAsia="Times New Roman" w:hAnsi="Times New Roman" w:cs="Times New Roman"/>
+          <w:sz w:val="20"/>
+          <w:szCs w:val="20"/>
+          <w:lang w:val="en-CA"/>
+        </w:rPr>
+        <w:t>https://oceandata.sci.gsfc.nasa.gov/cgi/getfile/S19980801998171.L3m_SNSP_CHL_chlor_a_9km.nc</w:t>
+      </w:r>
+    </w:p>
+    <w:p>
+      <w:pPr>
+        <w:rPr>
+          <w:rFonts w:ascii="Times New Roman" w:eastAsia="Times New Roman" w:hAnsi="Times New Roman" w:cs="Times New Roman"/>
+          <w:sz w:val="20"/>
+          <w:szCs w:val="20"/>
+          <w:lang w:val="en-CA"/>
+        </w:rPr>
+      </w:pPr>
+      <w:r>
+        <w:rPr>
+          <w:rFonts w:ascii="Times New Roman" w:eastAsia="Times New Roman" w:hAnsi="Times New Roman" w:cs="Times New Roman"/>
+          <w:sz w:val="20"/>
+          <w:szCs w:val="20"/>
+          <w:lang w:val="en-CA"/>
+        </w:rPr>
+        <w:t>https://oceandata.sci.gsfc.nasa.gov/cgi/getfile/S19981721998263.L3m_SNSU_CHL_chlor_a_9km.nc</w:t>
+      </w:r>
+    </w:p>
+    <w:p>
+      <w:pPr>
+        <w:rPr>
+          <w:rFonts w:ascii="Times New Roman" w:eastAsia="Times New Roman" w:hAnsi="Times New Roman" w:cs="Times New Roman"/>
+          <w:sz w:val="20"/>
+          <w:szCs w:val="20"/>
+          <w:lang w:val="en-CA"/>
+        </w:rPr>
+      </w:pPr>
+      <w:r>
+        <w:rPr>
+          <w:rFonts w:ascii="Times New Roman" w:eastAsia="Times New Roman" w:hAnsi="Times New Roman" w:cs="Times New Roman"/>
+          <w:sz w:val="20"/>
+          <w:szCs w:val="20"/>
+          <w:lang w:val="en-CA"/>
+        </w:rPr>
+        <w:t>https://oceandata.sci.gsfc.nasa.gov/cgi/getfile/S19982641998354.L3m_SNAU_CHL_chlor_a_9km.nc</w:t>
+      </w:r>
+    </w:p>
+    <w:p>
+      <w:pPr>
+        <w:rPr>
+          <w:rFonts w:ascii="Times New Roman" w:eastAsia="Times New Roman" w:hAnsi="Times New Roman" w:cs="Times New Roman"/>
+          <w:sz w:val="20"/>
+          <w:szCs w:val="20"/>
+          <w:lang w:val="en-CA"/>
+        </w:rPr>
+      </w:pPr>
+      <w:r>
+        <w:rPr>
+          <w:rFonts w:ascii="Times New Roman" w:eastAsia="Times New Roman" w:hAnsi="Times New Roman" w:cs="Times New Roman"/>
+          <w:sz w:val="20"/>
+          <w:szCs w:val="20"/>
+          <w:lang w:val="en-CA"/>
+        </w:rPr>
+        <w:t>https://oceandata.sci.gsfc.nasa.gov/cgi/getfile/S19983551999079.L3m_SNWI_CHL_chlor_a_9km.nc</w:t>
+      </w:r>
+    </w:p>
+    <w:p>
+      <w:pPr>
+        <w:rPr>
+          <w:rFonts w:ascii="Times New Roman" w:eastAsia="Times New Roman" w:hAnsi="Times New Roman" w:cs="Times New Roman"/>
+          <w:sz w:val="20"/>
+          <w:szCs w:val="20"/>
+          <w:lang w:val="en-CA"/>
+        </w:rPr>
+      </w:pPr>
+      <w:r>
+        <w:rPr>
+          <w:rFonts w:ascii="Times New Roman" w:eastAsia="Times New Roman" w:hAnsi="Times New Roman" w:cs="Times New Roman"/>
+          <w:sz w:val="20"/>
+          <w:szCs w:val="20"/>
+          <w:lang w:val="en-CA"/>
+        </w:rPr>
+        <w:t>https://oceandata.sci.gsfc.nasa.gov/cgi/getfile/S19990801999171.L3m_SNSP_CHL_chlor_a_9km.nc</w:t>
+      </w:r>
+    </w:p>
+    <w:p>
+      <w:pPr>
+        <w:rPr>
+          <w:rFonts w:ascii="Times New Roman" w:eastAsia="Times New Roman" w:hAnsi="Times New Roman" w:cs="Times New Roman"/>
+          <w:sz w:val="20"/>
+          <w:szCs w:val="20"/>
+          <w:lang w:val="en-CA"/>
+        </w:rPr>
+      </w:pPr>
+      <w:r>
+        <w:rPr>
+          <w:rFonts w:ascii="Times New Roman" w:eastAsia="Times New Roman" w:hAnsi="Times New Roman" w:cs="Times New Roman"/>
+          <w:sz w:val="20"/>
+          <w:szCs w:val="20"/>
+          <w:lang w:val="en-CA"/>
+        </w:rPr>
+        <w:t>https://oceandata.sci.gsfc.nasa.gov/cgi/getfile/S19991721999263.L3m_SNSU_CHL_chlor_a_9km.nc</w:t>
+      </w:r>
+    </w:p>
+    <w:p>
+      <w:pPr>
+        <w:rPr>
+          <w:rFonts w:ascii="Times New Roman" w:eastAsia="Times New Roman" w:hAnsi="Times New Roman" w:cs="Times New Roman"/>
+          <w:sz w:val="20"/>
+          <w:szCs w:val="20"/>
+          <w:lang w:val="en-CA"/>
+        </w:rPr>
+      </w:pPr>
+      <w:r>
+        <w:rPr>
+          <w:rFonts w:ascii="Times New Roman" w:eastAsia="Times New Roman" w:hAnsi="Times New Roman" w:cs="Times New Roman"/>
+          <w:sz w:val="20"/>
+          <w:szCs w:val="20"/>
+          <w:lang w:val="en-CA"/>
+        </w:rPr>
+        <w:t>https://oceandata.sci.gsfc.nasa.gov/cgi/getfile/S19992641999354.L3m_SNAU_CHL_chlor_a_9km.nc</w:t>
+      </w:r>
+    </w:p>
+    <w:p>
+      <w:pPr>
+        <w:rPr>
+          <w:rFonts w:ascii="Times New Roman" w:eastAsia="Times New Roman" w:hAnsi="Times New Roman" w:cs="Times New Roman"/>
+          <w:sz w:val="20"/>
+          <w:szCs w:val="20"/>
+          <w:lang w:val="en-CA"/>
+        </w:rPr>
+      </w:pPr>
+      <w:r>
+        <w:rPr>
+          <w:rFonts w:ascii="Times New Roman" w:eastAsia="Times New Roman" w:hAnsi="Times New Roman" w:cs="Times New Roman"/>
+          <w:sz w:val="20"/>
+          <w:szCs w:val="20"/>
+          <w:lang w:val="en-CA"/>
+        </w:rPr>
+        <w:t>https://oceandata.sci.gsfc.nasa.gov/cgi/getfile/S19993552000080.L3m_SNWI_CHL_chlor_a_9km.nc</w:t>
+      </w:r>
+    </w:p>
+    <w:p>
+      <w:pPr>
+        <w:rPr>
+          <w:rFonts w:ascii="Times New Roman" w:eastAsia="Times New Roman" w:hAnsi="Times New Roman" w:cs="Times New Roman"/>
+          <w:sz w:val="20"/>
+          <w:szCs w:val="20"/>
+          <w:lang w:val="en-CA"/>
+        </w:rPr>
+      </w:pPr>
+      <w:r>
+        <w:rPr>
+          <w:rFonts w:ascii="Times New Roman" w:eastAsia="Times New Roman" w:hAnsi="Times New Roman" w:cs="Times New Roman"/>
+          <w:sz w:val="20"/>
+          <w:szCs w:val="20"/>
+          <w:lang w:val="en-CA"/>
+        </w:rPr>
+        <w:t>https://oceandata.sci.gsfc.nasa.gov/cgi/getfile/S20000812000172.L3m_SNSP_CHL_chlor_a_9km.nc</w:t>
+      </w:r>
+    </w:p>
+    <w:p>
+      <w:pPr>
+        <w:rPr>
+          <w:rFonts w:ascii="Times New Roman" w:eastAsia="Times New Roman" w:hAnsi="Times New Roman" w:cs="Times New Roman"/>
+          <w:sz w:val="20"/>
+          <w:szCs w:val="20"/>
+          <w:lang w:val="en-CA"/>
+        </w:rPr>
+      </w:pPr>
+      <w:r>
+        <w:rPr>
+          <w:rFonts w:ascii="Times New Roman" w:eastAsia="Times New Roman" w:hAnsi="Times New Roman" w:cs="Times New Roman"/>
+          <w:sz w:val="20"/>
+          <w:szCs w:val="20"/>
+          <w:lang w:val="en-CA"/>
+        </w:rPr>
+        <w:t>https://oceandata.sci.gsfc.nasa.gov/cgi/getfile/S20001732000264.L3m_SNSU_CHL_chlor_a_9km.nc</w:t>
+      </w:r>
+    </w:p>
+    <w:p>
+      <w:pPr>
+        <w:rPr>
+          <w:rFonts w:ascii="Times New Roman" w:eastAsia="Times New Roman" w:hAnsi="Times New Roman" w:cs="Times New Roman"/>
+          <w:sz w:val="20"/>
+          <w:szCs w:val="20"/>
+          <w:lang w:val="en-CA"/>
+        </w:rPr>
+      </w:pPr>
+      <w:r>
+        <w:rPr>
+          <w:rFonts w:ascii="Times New Roman" w:eastAsia="Times New Roman" w:hAnsi="Times New Roman" w:cs="Times New Roman"/>
+          <w:sz w:val="20"/>
+          <w:szCs w:val="20"/>
+          <w:lang w:val="en-CA"/>
+        </w:rPr>
+        <w:t>https://oceandata.sci.gsfc.nasa.gov/cgi/getfile/S20002652000355.L3m_SNAU_CHL_chlor_a_9km.nc</w:t>
+      </w:r>
+    </w:p>
+    <w:p>
+      <w:pPr>
+        <w:rPr>
+          <w:rFonts w:ascii="Times New Roman" w:eastAsia="Times New Roman" w:hAnsi="Times New Roman" w:cs="Times New Roman"/>
+          <w:sz w:val="20"/>
+          <w:szCs w:val="20"/>
+          <w:lang w:val="en-CA"/>
+        </w:rPr>
+      </w:pPr>
+      <w:r>
+        <w:rPr>
+          <w:rFonts w:ascii="Times New Roman" w:eastAsia="Times New Roman" w:hAnsi="Times New Roman" w:cs="Times New Roman"/>
+          <w:sz w:val="20"/>
+          <w:szCs w:val="20"/>
+          <w:lang w:val="en-CA"/>
+        </w:rPr>
+        <w:t>https://oceandata.sci.gsfc.nasa.gov/cgi/getfile/S20003562001079.L3m_SNWI_CHL_chlor_a_9km.nc</w:t>
+      </w:r>
+    </w:p>
+    <w:p>
+      <w:pPr>
+        <w:rPr>
+          <w:rFonts w:ascii="Times New Roman" w:eastAsia="Times New Roman" w:hAnsi="Times New Roman" w:cs="Times New Roman"/>
+          <w:sz w:val="20"/>
+          <w:szCs w:val="20"/>
+          <w:lang w:val="en-CA"/>
+        </w:rPr>
+      </w:pPr>
+      <w:r>
+        <w:rPr>
+          <w:rFonts w:ascii="Times New Roman" w:eastAsia="Times New Roman" w:hAnsi="Times New Roman" w:cs="Times New Roman"/>
+          <w:sz w:val="20"/>
+          <w:szCs w:val="20"/>
+          <w:lang w:val="en-CA"/>
+        </w:rPr>
+        <w:t>https://oceandata.sci.gsfc.nasa.gov/cgi/getfile/S20010802001171.L3m_SNSP_CHL_chlor_a_9km.nc</w:t>
+      </w:r>
+    </w:p>
+    <w:p>
+      <w:pPr>
+        <w:rPr>
+          <w:rFonts w:ascii="Times New Roman" w:eastAsia="Times New Roman" w:hAnsi="Times New Roman" w:cs="Times New Roman"/>
+          <w:sz w:val="20"/>
+          <w:szCs w:val="20"/>
+          <w:lang w:val="en-CA"/>
+        </w:rPr>
+      </w:pPr>
+      <w:r>
+        <w:rPr>
+          <w:rFonts w:ascii="Times New Roman" w:eastAsia="Times New Roman" w:hAnsi="Times New Roman" w:cs="Times New Roman"/>
+          <w:sz w:val="20"/>
+          <w:szCs w:val="20"/>
+          <w:lang w:val="en-CA"/>
+        </w:rPr>
+        <w:lastRenderedPageBreak/>
+        <w:t>https://oceandata.sci.gsfc.nasa.gov/cgi/getfile/S20011722001263.L3m_SNSU_CHL_chlor_a_9km.nc</w:t>
+      </w:r>
+    </w:p>
+    <w:p>
+      <w:pPr>
+        <w:rPr>
+          <w:rFonts w:ascii="Times New Roman" w:eastAsia="Times New Roman" w:hAnsi="Times New Roman" w:cs="Times New Roman"/>
+          <w:sz w:val="20"/>
+          <w:szCs w:val="20"/>
+          <w:lang w:val="en-CA"/>
+        </w:rPr>
+      </w:pPr>
+      <w:r>
+        <w:rPr>
+          <w:rFonts w:ascii="Times New Roman" w:eastAsia="Times New Roman" w:hAnsi="Times New Roman" w:cs="Times New Roman"/>
+          <w:sz w:val="20"/>
+          <w:szCs w:val="20"/>
+          <w:lang w:val="en-CA"/>
+        </w:rPr>
+        <w:t>https://oceandata.sci.gsfc.nasa.gov/cgi/getfile/S20012642001354.L3m_SNAU_CHL_chlor_a_9km.nc</w:t>
+      </w:r>
+    </w:p>
+    <w:p>
+      <w:pPr>
+        <w:rPr>
+          <w:rFonts w:ascii="Times New Roman" w:eastAsia="Times New Roman" w:hAnsi="Times New Roman" w:cs="Times New Roman"/>
+          <w:sz w:val="20"/>
+          <w:szCs w:val="20"/>
+          <w:lang w:val="en-CA"/>
+        </w:rPr>
+      </w:pPr>
+      <w:r>
+        <w:rPr>
+          <w:rFonts w:ascii="Times New Roman" w:eastAsia="Times New Roman" w:hAnsi="Times New Roman" w:cs="Times New Roman"/>
+          <w:sz w:val="20"/>
+          <w:szCs w:val="20"/>
+          <w:lang w:val="en-CA"/>
+        </w:rPr>
+        <w:t>https://oceandata.sci.gsfc.nasa.gov/cgi/getfile/S20013552002079.L3m_SNWI_CHL_chlor_a_9km.nc</w:t>
+      </w:r>
+    </w:p>
+    <w:p>
+      <w:pPr>
+        <w:rPr>
+          <w:rFonts w:ascii="Times New Roman" w:eastAsia="Times New Roman" w:hAnsi="Times New Roman" w:cs="Times New Roman"/>
+          <w:sz w:val="20"/>
+          <w:szCs w:val="20"/>
+          <w:lang w:val="en-CA"/>
+        </w:rPr>
+      </w:pPr>
+      <w:r>
+        <w:rPr>
+          <w:rFonts w:ascii="Times New Roman" w:eastAsia="Times New Roman" w:hAnsi="Times New Roman" w:cs="Times New Roman"/>
+          <w:sz w:val="20"/>
+          <w:szCs w:val="20"/>
+          <w:lang w:val="en-CA"/>
+        </w:rPr>
+        <w:t>https://oceandata.sci.gsfc.nasa.gov/cgi/getfile/S20020802002171.L3m_SNSP_CHL_chlor_a_9km.nc</w:t>
+      </w:r>
+    </w:p>
+    <w:p/>
+    <w:p>
+      <w:pPr>
+        <w:rPr>
+          <w:rFonts w:ascii="Times" w:eastAsia="Times New Roman" w:hAnsi="Times" w:cs="Times New Roman"/>
+          <w:b/>
+          <w:bCs/>
+          <w:color w:val="000000"/>
+          <w:sz w:val="20"/>
+          <w:szCs w:val="20"/>
+          <w:lang w:val="en-CA"/>
+        </w:rPr>
+      </w:pPr>
+      <w:r>
+        <w:rPr>
+          <w:rFonts w:ascii="Times" w:eastAsia="Times New Roman" w:hAnsi="Times" w:cs="Times New Roman"/>
+          <w:b/>
+          <w:bCs/>
+          <w:color w:val="000000"/>
+          <w:sz w:val="20"/>
+          <w:szCs w:val="20"/>
+          <w:lang w:val="en-CA"/>
+        </w:rPr>
+        <w:t>SEASONAL LINKS: MODIS AQUA</w:t>
+      </w:r>
+      <w:r>
+        <w:rPr>
+          <w:rFonts w:ascii="Times" w:eastAsia="Times New Roman" w:hAnsi="Times" w:cs="Times New Roman"/>
+          <w:b/>
+          <w:bCs/>
+          <w:color w:val="000000"/>
+          <w:sz w:val="20"/>
+          <w:szCs w:val="20"/>
+          <w:lang w:val="en-CA"/>
+        </w:rPr>
+        <w:t xml:space="preserve"> 2002-2022</w:t>
+      </w:r>
+    </w:p>
+    <w:p>
+      <w:pPr>
+        <w:rPr>
+          <w:rFonts w:ascii="Times" w:eastAsia="Times New Roman" w:hAnsi="Times" w:cs="Times New Roman"/>
+          <w:color w:val="000000"/>
           <w:sz w:val="20"/>
           <w:szCs w:val="20"/>
           <w:lang w:val="en-CA"/>
@@ -590,6 +1695,16 @@
           <w:lang w:val="en-CA"/>
         </w:rPr>
         <w:br/>
+      </w:r>
+      <w:r>
+        <w:rPr>
+          <w:rFonts w:ascii="Times" w:eastAsia="Times New Roman" w:hAnsi="Times" w:cs="Times New Roman"/>
+          <w:color w:val="000000"/>
+          <w:sz w:val="20"/>
+          <w:szCs w:val="20"/>
+          <w:lang w:val="en-CA"/>
+        </w:rPr>
+        <w:lastRenderedPageBreak/>
         <w:t>https://oceandata.sci.gsfc.nasa.gov/cgi/getfile/A20142642014354.L3m_SNAU_CHL_chlor_a_4km.nc</w:t>
       </w:r>
       <w:r>
@@ -645,380 +1760,755 @@
           <w:lang w:val="en-CA"/>
         </w:rPr>
         <w:br/>
-      </w:r>
-      <w:r>
-        <w:rPr>
-          <w:rFonts w:ascii="Times" w:eastAsia="Times New Roman" w:hAnsi="Times" w:cs="Times New Roman"/>
-          <w:color w:val="000000"/>
-          <w:sz w:val="20"/>
-          <w:szCs w:val="20"/>
-          <w:lang w:val="en-CA"/>
+        <w:t>https://oceandata.sci.gsfc.nasa.gov/cgi/getfile/A20153552016080.L3m_SNWI_CHL_chlor_a_4km.nc</w:t>
+      </w:r>
+      <w:r>
+        <w:rPr>
+          <w:rFonts w:ascii="Times" w:eastAsia="Times New Roman" w:hAnsi="Times" w:cs="Times New Roman"/>
+          <w:color w:val="000000"/>
+          <w:sz w:val="20"/>
+          <w:szCs w:val="20"/>
+          <w:lang w:val="en-CA"/>
+        </w:rPr>
+        <w:br/>
+        <w:t>https://oceandata.sci.gsfc.nasa.gov/cgi/getfile/A20160812016172.L3m_SNSP_CHL_chlor_a_4km.nc</w:t>
+      </w:r>
+      <w:r>
+        <w:rPr>
+          <w:rFonts w:ascii="Times" w:eastAsia="Times New Roman" w:hAnsi="Times" w:cs="Times New Roman"/>
+          <w:color w:val="000000"/>
+          <w:sz w:val="20"/>
+          <w:szCs w:val="20"/>
+          <w:lang w:val="en-CA"/>
+        </w:rPr>
+        <w:br/>
+        <w:t>https://oceandata.sci.gsfc.nasa.gov/cgi/getfile/A20161732016264.L3m_SNSU_CHL_chlor_a_4km.nc</w:t>
+      </w:r>
+      <w:r>
+        <w:rPr>
+          <w:rFonts w:ascii="Times" w:eastAsia="Times New Roman" w:hAnsi="Times" w:cs="Times New Roman"/>
+          <w:color w:val="000000"/>
+          <w:sz w:val="20"/>
+          <w:szCs w:val="20"/>
+          <w:lang w:val="en-CA"/>
+        </w:rPr>
+        <w:br/>
+        <w:t>https://oceandata.sci.gsfc.nasa.gov/cgi/getfile/A20162652016355.L3m_SNAU_CHL_chlor_a_4km.nc</w:t>
+      </w:r>
+      <w:r>
+        <w:rPr>
+          <w:rFonts w:ascii="Times" w:eastAsia="Times New Roman" w:hAnsi="Times" w:cs="Times New Roman"/>
+          <w:color w:val="000000"/>
+          <w:sz w:val="20"/>
+          <w:szCs w:val="20"/>
+          <w:lang w:val="en-CA"/>
+        </w:rPr>
+        <w:br/>
+        <w:t>https://oceandata.sci.gsfc.nasa.gov/cgi/getfile/A20163562017079.L3m_SNWI_CHL_chlor_a_4km.nc</w:t>
+      </w:r>
+      <w:r>
+        <w:rPr>
+          <w:rFonts w:ascii="Times" w:eastAsia="Times New Roman" w:hAnsi="Times" w:cs="Times New Roman"/>
+          <w:color w:val="000000"/>
+          <w:sz w:val="20"/>
+          <w:szCs w:val="20"/>
+          <w:lang w:val="en-CA"/>
+        </w:rPr>
+        <w:br/>
+        <w:t>https://oceandata.sci.gsfc.nasa.gov/cgi/getfile/A20170802017171.L3m_SNSP_CHL_chlor_a_4km.nc</w:t>
+      </w:r>
+      <w:r>
+        <w:rPr>
+          <w:rFonts w:ascii="Times" w:eastAsia="Times New Roman" w:hAnsi="Times" w:cs="Times New Roman"/>
+          <w:color w:val="000000"/>
+          <w:sz w:val="20"/>
+          <w:szCs w:val="20"/>
+          <w:lang w:val="en-CA"/>
+        </w:rPr>
+        <w:br/>
+        <w:t>https://oceandata.sci.gsfc.nasa.gov/cgi/getfile/A20171722017263.L3m_SNSU_CHL_chlor_a_4km.nc</w:t>
+      </w:r>
+      <w:r>
+        <w:rPr>
+          <w:rFonts w:ascii="Times" w:eastAsia="Times New Roman" w:hAnsi="Times" w:cs="Times New Roman"/>
+          <w:color w:val="000000"/>
+          <w:sz w:val="20"/>
+          <w:szCs w:val="20"/>
+          <w:lang w:val="en-CA"/>
+        </w:rPr>
+        <w:br/>
+        <w:t>https://oceandata.sci.gsfc.nasa.gov/cgi/getfile/A20172642017354.L3m_SNAU_CHL_chlor_a_4km.nc</w:t>
+      </w:r>
+      <w:r>
+        <w:rPr>
+          <w:rFonts w:ascii="Times" w:eastAsia="Times New Roman" w:hAnsi="Times" w:cs="Times New Roman"/>
+          <w:color w:val="000000"/>
+          <w:sz w:val="20"/>
+          <w:szCs w:val="20"/>
+          <w:lang w:val="en-CA"/>
+        </w:rPr>
+        <w:br/>
+        <w:t>https://oceandata.sci.gsfc.nasa.gov/cgi/getfile/A20173552018079.L3m_SNWI_CHL_chlor_a_4km.nc</w:t>
+      </w:r>
+      <w:r>
+        <w:rPr>
+          <w:rFonts w:ascii="Times" w:eastAsia="Times New Roman" w:hAnsi="Times" w:cs="Times New Roman"/>
+          <w:color w:val="000000"/>
+          <w:sz w:val="20"/>
+          <w:szCs w:val="20"/>
+          <w:lang w:val="en-CA"/>
+        </w:rPr>
+        <w:br/>
+        <w:t>https://oceandata.sci.gsfc.nasa.gov/cgi/getfile/A20180802018171.L3m_SNSP_CHL_chlor_a_4km.nc</w:t>
+      </w:r>
+      <w:r>
+        <w:rPr>
+          <w:rFonts w:ascii="Times" w:eastAsia="Times New Roman" w:hAnsi="Times" w:cs="Times New Roman"/>
+          <w:color w:val="000000"/>
+          <w:sz w:val="20"/>
+          <w:szCs w:val="20"/>
+          <w:lang w:val="en-CA"/>
+        </w:rPr>
+        <w:br/>
+        <w:t>https://oceandata.sci.gsfc.nasa.gov/cgi/getfile/A20181722018263.L3m_SNSU_CHL_chlor_a_4km.nc</w:t>
+      </w:r>
+      <w:r>
+        <w:rPr>
+          <w:rFonts w:ascii="Times" w:eastAsia="Times New Roman" w:hAnsi="Times" w:cs="Times New Roman"/>
+          <w:color w:val="000000"/>
+          <w:sz w:val="20"/>
+          <w:szCs w:val="20"/>
+          <w:lang w:val="en-CA"/>
+        </w:rPr>
+        <w:br/>
+        <w:t>https://oceandata.sci.gsfc.nasa.gov/cgi/getfile/A20182642018354.L3m_SNAU_CHL_chlor_a_4km.nc</w:t>
+      </w:r>
+      <w:r>
+        <w:rPr>
+          <w:rFonts w:ascii="Times" w:eastAsia="Times New Roman" w:hAnsi="Times" w:cs="Times New Roman"/>
+          <w:color w:val="000000"/>
+          <w:sz w:val="20"/>
+          <w:szCs w:val="20"/>
+          <w:lang w:val="en-CA"/>
+        </w:rPr>
+        <w:br/>
+        <w:t>https://oceandata.sci.gsfc.nasa.gov/cgi/getfile/A20183552019079.L3m_SNWI_CHL_chlor_a_4km.nc</w:t>
+      </w:r>
+      <w:r>
+        <w:rPr>
+          <w:rFonts w:ascii="Times" w:eastAsia="Times New Roman" w:hAnsi="Times" w:cs="Times New Roman"/>
+          <w:color w:val="000000"/>
+          <w:sz w:val="20"/>
+          <w:szCs w:val="20"/>
+          <w:lang w:val="en-CA"/>
+        </w:rPr>
+        <w:br/>
+        <w:t>https://oceandata.sci.gsfc.nasa.gov/cgi/getfile/A20190802019171.L3m_SNSP_CHL_chlor_a_4km.nc</w:t>
+      </w:r>
+      <w:r>
+        <w:rPr>
+          <w:rFonts w:ascii="Times" w:eastAsia="Times New Roman" w:hAnsi="Times" w:cs="Times New Roman"/>
+          <w:color w:val="000000"/>
+          <w:sz w:val="20"/>
+          <w:szCs w:val="20"/>
+          <w:lang w:val="en-CA"/>
+        </w:rPr>
+        <w:br/>
+        <w:t>https://oceandata.sci.gsfc.nasa.gov/cgi/getfile/A20191722019263.L3m_SNSU_CHL_chlor_a_4km.nc</w:t>
+      </w:r>
+      <w:r>
+        <w:rPr>
+          <w:rFonts w:ascii="Times" w:eastAsia="Times New Roman" w:hAnsi="Times" w:cs="Times New Roman"/>
+          <w:color w:val="000000"/>
+          <w:sz w:val="20"/>
+          <w:szCs w:val="20"/>
+          <w:lang w:val="en-CA"/>
+        </w:rPr>
+        <w:br/>
+        <w:t>https://oceandata.sci.gsfc.nasa.gov/cgi/getfile/A20192642019354.L3m_SNAU_CHL_chlor_a_4km.nc</w:t>
+      </w:r>
+      <w:r>
+        <w:rPr>
+          <w:rFonts w:ascii="Times" w:eastAsia="Times New Roman" w:hAnsi="Times" w:cs="Times New Roman"/>
+          <w:color w:val="000000"/>
+          <w:sz w:val="20"/>
+          <w:szCs w:val="20"/>
+          <w:lang w:val="en-CA"/>
+        </w:rPr>
+        <w:br/>
+        <w:t>https://oceandata.sci.gsfc.nasa.gov/cgi/getfile/A20193552020080.L3m_SNWI_CHL_chlor_a_4km.nc</w:t>
+      </w:r>
+      <w:r>
+        <w:rPr>
+          <w:rFonts w:ascii="Times" w:eastAsia="Times New Roman" w:hAnsi="Times" w:cs="Times New Roman"/>
+          <w:color w:val="000000"/>
+          <w:sz w:val="20"/>
+          <w:szCs w:val="20"/>
+          <w:lang w:val="en-CA"/>
+        </w:rPr>
+        <w:br/>
+        <w:t>https://oceandata.sci.gsfc.nasa.gov/cgi/getfile/A20200812020172.L3m_SNSP_CHL_chlor_a_4km.nc</w:t>
+      </w:r>
+      <w:r>
+        <w:rPr>
+          <w:rFonts w:ascii="Times" w:eastAsia="Times New Roman" w:hAnsi="Times" w:cs="Times New Roman"/>
+          <w:color w:val="000000"/>
+          <w:sz w:val="20"/>
+          <w:szCs w:val="20"/>
+          <w:lang w:val="en-CA"/>
+        </w:rPr>
+        <w:br/>
+        <w:t>https://oceandata.sci.gsfc.nasa.gov/cgi/getfile/A20201732020264.L3m_SNSU_CHL_chlor_a_4km.nc</w:t>
+      </w:r>
+      <w:r>
+        <w:rPr>
+          <w:rFonts w:ascii="Times" w:eastAsia="Times New Roman" w:hAnsi="Times" w:cs="Times New Roman"/>
+          <w:color w:val="000000"/>
+          <w:sz w:val="20"/>
+          <w:szCs w:val="20"/>
+          <w:lang w:val="en-CA"/>
+        </w:rPr>
+        <w:br/>
+        <w:t>https://oceandata.sci.gsfc.nasa.gov/cgi/getfile/A20202652020355.L3m_SNAU_CHL_chlor_a_4km.nc</w:t>
+      </w:r>
+      <w:r>
+        <w:rPr>
+          <w:rFonts w:ascii="Times" w:eastAsia="Times New Roman" w:hAnsi="Times" w:cs="Times New Roman"/>
+          <w:color w:val="000000"/>
+          <w:sz w:val="20"/>
+          <w:szCs w:val="20"/>
+          <w:lang w:val="en-CA"/>
+        </w:rPr>
+        <w:br/>
+        <w:t>https://oceandata.sci.gsfc.nasa.gov/cgi/getfile/A20203562021079.L3m_SNWI_CHL_chlor_a_4km.nc</w:t>
+      </w:r>
+    </w:p>
+    <w:p>
+      <w:pPr>
+        <w:rPr>
+          <w:rFonts w:ascii="Times" w:eastAsia="Times New Roman" w:hAnsi="Times" w:cs="Times New Roman"/>
+          <w:color w:val="000000"/>
+          <w:sz w:val="20"/>
+          <w:szCs w:val="20"/>
+          <w:lang w:val="en-CA"/>
+        </w:rPr>
+      </w:pPr>
+    </w:p>
+    <w:p>
+      <w:r>
+        <w:t xml:space="preserve">ANNUAL LINKS: </w:t>
+      </w:r>
+      <w:r>
+        <w:t>CZCS</w:t>
+      </w:r>
+      <w:r>
+        <w:t xml:space="preserve"> </w:t>
+      </w:r>
+      <w:r>
+        <w:t>1978-1986</w:t>
+      </w:r>
+    </w:p>
+    <w:p>
+      <w:pPr>
+        <w:rPr>
+          <w:rFonts w:ascii="Times" w:eastAsia="Times New Roman" w:hAnsi="Times" w:cs="Times New Roman"/>
+          <w:color w:val="000000"/>
+          <w:sz w:val="20"/>
+          <w:szCs w:val="20"/>
+          <w:lang w:val="en-CA"/>
+        </w:rPr>
+      </w:pPr>
+      <w:r>
+        <w:rPr>
+          <w:rFonts w:ascii="Times" w:eastAsia="Times New Roman" w:hAnsi="Times" w:cs="Times New Roman"/>
+          <w:color w:val="000000"/>
+          <w:sz w:val="20"/>
+          <w:szCs w:val="20"/>
+          <w:lang w:val="en-CA"/>
+        </w:rPr>
+        <w:t>https://oceandata.sci.gsfc.nasa.gov/cgi/getfile/C19780011978365.L3m_YR_CHL_chl_ocx_4km.nc</w:t>
+      </w:r>
+    </w:p>
+    <w:p>
+      <w:pPr>
+        <w:rPr>
+          <w:rFonts w:ascii="Times" w:eastAsia="Times New Roman" w:hAnsi="Times" w:cs="Times New Roman"/>
+          <w:color w:val="000000"/>
+          <w:sz w:val="20"/>
+          <w:szCs w:val="20"/>
+          <w:lang w:val="en-CA"/>
+        </w:rPr>
+      </w:pPr>
+      <w:r>
+        <w:rPr>
+          <w:rFonts w:ascii="Times" w:eastAsia="Times New Roman" w:hAnsi="Times" w:cs="Times New Roman"/>
+          <w:color w:val="000000"/>
+          <w:sz w:val="20"/>
+          <w:szCs w:val="20"/>
+          <w:lang w:val="en-CA"/>
+        </w:rPr>
+        <w:t>https://oceandata.sci.gsfc.nasa.gov/cgi/getfile/C19790011979365.L3m_YR_CHL_chl_ocx_4km.nc</w:t>
+      </w:r>
+    </w:p>
+    <w:p>
+      <w:pPr>
+        <w:rPr>
+          <w:rFonts w:ascii="Times" w:eastAsia="Times New Roman" w:hAnsi="Times" w:cs="Times New Roman"/>
+          <w:color w:val="000000"/>
+          <w:sz w:val="20"/>
+          <w:szCs w:val="20"/>
+          <w:lang w:val="en-CA"/>
+        </w:rPr>
+      </w:pPr>
+      <w:r>
+        <w:rPr>
+          <w:rFonts w:ascii="Times" w:eastAsia="Times New Roman" w:hAnsi="Times" w:cs="Times New Roman"/>
+          <w:color w:val="000000"/>
+          <w:sz w:val="20"/>
+          <w:szCs w:val="20"/>
+          <w:lang w:val="en-CA"/>
+        </w:rPr>
+        <w:t>https://oceandata.sci.gsfc.nasa.gov/cgi/getfile/C19800011980366.L3m_YR_CHL_chl_ocx_4km.nc</w:t>
+      </w:r>
+    </w:p>
+    <w:p>
+      <w:pPr>
+        <w:rPr>
+          <w:rFonts w:ascii="Times" w:eastAsia="Times New Roman" w:hAnsi="Times" w:cs="Times New Roman"/>
+          <w:color w:val="000000"/>
+          <w:sz w:val="20"/>
+          <w:szCs w:val="20"/>
+          <w:lang w:val="en-CA"/>
+        </w:rPr>
+      </w:pPr>
+      <w:r>
+        <w:rPr>
+          <w:rFonts w:ascii="Times" w:eastAsia="Times New Roman" w:hAnsi="Times" w:cs="Times New Roman"/>
+          <w:color w:val="000000"/>
+          <w:sz w:val="20"/>
+          <w:szCs w:val="20"/>
+          <w:lang w:val="en-CA"/>
+        </w:rPr>
+        <w:t>https://oceandata.sci.gsfc.nasa.gov/cgi/getfile/C19810011981365.L3m_YR_CHL_chl_ocx_4km.nc</w:t>
+      </w:r>
+    </w:p>
+    <w:p>
+      <w:pPr>
+        <w:rPr>
+          <w:rFonts w:ascii="Times" w:eastAsia="Times New Roman" w:hAnsi="Times" w:cs="Times New Roman"/>
+          <w:color w:val="000000"/>
+          <w:sz w:val="20"/>
+          <w:szCs w:val="20"/>
+          <w:lang w:val="en-CA"/>
+        </w:rPr>
+      </w:pPr>
+      <w:r>
+        <w:rPr>
+          <w:rFonts w:ascii="Times" w:eastAsia="Times New Roman" w:hAnsi="Times" w:cs="Times New Roman"/>
+          <w:color w:val="000000"/>
+          <w:sz w:val="20"/>
+          <w:szCs w:val="20"/>
+          <w:lang w:val="en-CA"/>
+        </w:rPr>
+        <w:t>https://oceandata.sci.gsfc.nasa.gov/cgi/getfile/C19820011982365.L3m_YR_CHL_chl_ocx_4km.nc</w:t>
+      </w:r>
+    </w:p>
+    <w:p>
+      <w:pPr>
+        <w:rPr>
+          <w:rFonts w:ascii="Times" w:eastAsia="Times New Roman" w:hAnsi="Times" w:cs="Times New Roman"/>
+          <w:color w:val="000000"/>
+          <w:sz w:val="20"/>
+          <w:szCs w:val="20"/>
+          <w:lang w:val="en-CA"/>
+        </w:rPr>
+      </w:pPr>
+      <w:r>
+        <w:rPr>
+          <w:rFonts w:ascii="Times" w:eastAsia="Times New Roman" w:hAnsi="Times" w:cs="Times New Roman"/>
+          <w:color w:val="000000"/>
+          <w:sz w:val="20"/>
+          <w:szCs w:val="20"/>
+          <w:lang w:val="en-CA"/>
+        </w:rPr>
+        <w:t>https://oceandata.sci.gsfc.nasa.gov/cgi/getfile/C19830011983365.L3m_YR_CHL_chl_ocx_4km.nc</w:t>
+      </w:r>
+    </w:p>
+    <w:p>
+      <w:pPr>
+        <w:rPr>
+          <w:rFonts w:ascii="Times" w:eastAsia="Times New Roman" w:hAnsi="Times" w:cs="Times New Roman"/>
+          <w:color w:val="000000"/>
+          <w:sz w:val="20"/>
+          <w:szCs w:val="20"/>
+          <w:lang w:val="en-CA"/>
+        </w:rPr>
+      </w:pPr>
+      <w:r>
+        <w:rPr>
+          <w:rFonts w:ascii="Times" w:eastAsia="Times New Roman" w:hAnsi="Times" w:cs="Times New Roman"/>
+          <w:color w:val="000000"/>
+          <w:sz w:val="20"/>
+          <w:szCs w:val="20"/>
+          <w:lang w:val="en-CA"/>
+        </w:rPr>
+        <w:t>https://oceandata.sci.gsfc.nasa.gov/cgi/getfile/C19840011984366.L3m_YR_CHL_chl_ocx_4km.nc</w:t>
+      </w:r>
+    </w:p>
+    <w:p>
+      <w:pPr>
+        <w:rPr>
+          <w:rFonts w:ascii="Times" w:eastAsia="Times New Roman" w:hAnsi="Times" w:cs="Times New Roman"/>
+          <w:color w:val="000000"/>
+          <w:sz w:val="20"/>
+          <w:szCs w:val="20"/>
+          <w:lang w:val="en-CA"/>
+        </w:rPr>
+      </w:pPr>
+      <w:r>
+        <w:rPr>
+          <w:rFonts w:ascii="Times" w:eastAsia="Times New Roman" w:hAnsi="Times" w:cs="Times New Roman"/>
+          <w:color w:val="000000"/>
+          <w:sz w:val="20"/>
+          <w:szCs w:val="20"/>
+          <w:lang w:val="en-CA"/>
+        </w:rPr>
+        <w:t>https://oceandata.sci.gsfc.nasa.gov/cgi/getfile/C19850011985365.L3m_YR_CHL_chl_ocx_4km.nc</w:t>
+      </w:r>
+    </w:p>
+    <w:p>
+      <w:pPr>
+        <w:rPr>
+          <w:rFonts w:ascii="Times" w:eastAsia="Times New Roman" w:hAnsi="Times" w:cs="Times New Roman"/>
+          <w:color w:val="000000"/>
+          <w:sz w:val="20"/>
+          <w:szCs w:val="20"/>
+          <w:lang w:val="en-CA"/>
+        </w:rPr>
+      </w:pPr>
+      <w:r>
+        <w:rPr>
+          <w:rFonts w:ascii="Times" w:eastAsia="Times New Roman" w:hAnsi="Times" w:cs="Times New Roman"/>
+          <w:color w:val="000000"/>
+          <w:sz w:val="20"/>
+          <w:szCs w:val="20"/>
+          <w:lang w:val="en-CA"/>
+        </w:rPr>
+        <w:t>https://oceandata.sci.gsfc.nasa.gov/cgi/getfile/C19860011986365.L3m_YR_CHL_chl_ocx_4km.nc</w:t>
+      </w:r>
+    </w:p>
+    <w:p>
+      <w:pPr>
+        <w:rPr>
+          <w:rFonts w:ascii="Times" w:eastAsia="Times New Roman" w:hAnsi="Times" w:cs="Times New Roman"/>
+          <w:color w:val="000000"/>
+          <w:sz w:val="20"/>
+          <w:szCs w:val="20"/>
+          <w:lang w:val="en-CA"/>
+        </w:rPr>
+      </w:pPr>
+    </w:p>
+    <w:p>
+      <w:r>
+        <w:t xml:space="preserve">ANNUAL LINKS: </w:t>
+      </w:r>
+      <w:proofErr w:type="spellStart"/>
+      <w:r>
+        <w:t>SeaWiFS</w:t>
+      </w:r>
+      <w:proofErr w:type="spellEnd"/>
+      <w:r>
+        <w:t xml:space="preserve"> </w:t>
+      </w:r>
+      <w:r>
+        <w:t>1997-2002</w:t>
+      </w:r>
+      <w:bookmarkStart w:id="0" w:name="_GoBack"/>
+      <w:bookmarkEnd w:id="0"/>
+    </w:p>
+    <w:p>
+      <w:pPr>
+        <w:rPr>
+          <w:rFonts w:ascii="Times" w:eastAsia="Times New Roman" w:hAnsi="Times" w:cs="Times New Roman"/>
+          <w:color w:val="000000"/>
+          <w:sz w:val="20"/>
+          <w:szCs w:val="20"/>
+          <w:lang w:val="en-CA"/>
+        </w:rPr>
+      </w:pPr>
+    </w:p>
+    <w:p>
+      <w:pPr>
+        <w:rPr>
+          <w:rFonts w:ascii="Times" w:eastAsia="Times New Roman" w:hAnsi="Times" w:cs="Times New Roman"/>
+          <w:color w:val="000000"/>
+          <w:sz w:val="20"/>
+          <w:szCs w:val="20"/>
+          <w:lang w:val="en-CA"/>
+        </w:rPr>
+      </w:pPr>
+      <w:r>
+        <w:rPr>
+          <w:rFonts w:ascii="Times" w:eastAsia="Times New Roman" w:hAnsi="Times" w:cs="Times New Roman"/>
+          <w:color w:val="000000"/>
+          <w:sz w:val="20"/>
+          <w:szCs w:val="20"/>
+          <w:lang w:val="en-CA"/>
+        </w:rPr>
+        <w:t>https://oceandata.sci.gsfc.nasa.gov/cgi/getfile/S19970011997365.L3m_YR_CHL_chlor_a_9km.nc</w:t>
+      </w:r>
+    </w:p>
+    <w:p>
+      <w:pPr>
+        <w:rPr>
+          <w:rFonts w:ascii="Times" w:eastAsia="Times New Roman" w:hAnsi="Times" w:cs="Times New Roman"/>
+          <w:color w:val="000000"/>
+          <w:sz w:val="20"/>
+          <w:szCs w:val="20"/>
+          <w:lang w:val="en-CA"/>
+        </w:rPr>
+      </w:pPr>
+      <w:r>
+        <w:rPr>
+          <w:rFonts w:ascii="Times" w:eastAsia="Times New Roman" w:hAnsi="Times" w:cs="Times New Roman"/>
+          <w:color w:val="000000"/>
+          <w:sz w:val="20"/>
+          <w:szCs w:val="20"/>
+          <w:lang w:val="en-CA"/>
+        </w:rPr>
+        <w:t>https://oceandata.sci.gsfc.nasa.gov/cgi/getfile/S19980011998365.L3m_YR_CHL_chlor_a_9km.nc</w:t>
+      </w:r>
+    </w:p>
+    <w:p>
+      <w:pPr>
+        <w:rPr>
+          <w:rFonts w:ascii="Times" w:eastAsia="Times New Roman" w:hAnsi="Times" w:cs="Times New Roman"/>
+          <w:color w:val="000000"/>
+          <w:sz w:val="20"/>
+          <w:szCs w:val="20"/>
+          <w:lang w:val="en-CA"/>
+        </w:rPr>
+      </w:pPr>
+      <w:r>
+        <w:rPr>
+          <w:rFonts w:ascii="Times" w:eastAsia="Times New Roman" w:hAnsi="Times" w:cs="Times New Roman"/>
+          <w:color w:val="000000"/>
+          <w:sz w:val="20"/>
+          <w:szCs w:val="20"/>
+          <w:lang w:val="en-CA"/>
+        </w:rPr>
+        <w:t>https://oceandata.sci.gsfc.nasa.gov/cgi/getfile/S19990011999365.L3m_YR_CHL_chlor_a_9km.nc</w:t>
+      </w:r>
+    </w:p>
+    <w:p>
+      <w:pPr>
+        <w:rPr>
+          <w:rFonts w:ascii="Times" w:eastAsia="Times New Roman" w:hAnsi="Times" w:cs="Times New Roman"/>
+          <w:color w:val="000000"/>
+          <w:sz w:val="20"/>
+          <w:szCs w:val="20"/>
+          <w:lang w:val="en-CA"/>
+        </w:rPr>
+      </w:pPr>
+      <w:r>
+        <w:rPr>
+          <w:rFonts w:ascii="Times" w:eastAsia="Times New Roman" w:hAnsi="Times" w:cs="Times New Roman"/>
+          <w:color w:val="000000"/>
+          <w:sz w:val="20"/>
+          <w:szCs w:val="20"/>
+          <w:lang w:val="en-CA"/>
+        </w:rPr>
+        <w:t>https://oceandata.sci.gsfc.nasa.gov/cgi/getfile/S20000012000366.L3m_YR_CHL_chlor_a_9km.nc</w:t>
+      </w:r>
+    </w:p>
+    <w:p>
+      <w:pPr>
+        <w:rPr>
+          <w:rFonts w:ascii="Times" w:eastAsia="Times New Roman" w:hAnsi="Times" w:cs="Times New Roman"/>
+          <w:color w:val="000000"/>
+          <w:sz w:val="20"/>
+          <w:szCs w:val="20"/>
+          <w:lang w:val="en-CA"/>
+        </w:rPr>
+      </w:pPr>
+      <w:r>
+        <w:rPr>
+          <w:rFonts w:ascii="Times" w:eastAsia="Times New Roman" w:hAnsi="Times" w:cs="Times New Roman"/>
+          <w:color w:val="000000"/>
+          <w:sz w:val="20"/>
+          <w:szCs w:val="20"/>
+          <w:lang w:val="en-CA"/>
+        </w:rPr>
+        <w:t>https://oceandata.sci.gsfc.nasa.gov/cgi/getfile/S20010012001365.L3m_YR_CHL_chlor_a_9km.nc</w:t>
+      </w:r>
+    </w:p>
+    <w:p>
+      <w:pPr>
+        <w:rPr>
+          <w:rFonts w:ascii="Times" w:eastAsia="Times New Roman" w:hAnsi="Times" w:cs="Times New Roman"/>
+          <w:color w:val="000000"/>
+          <w:sz w:val="20"/>
+          <w:szCs w:val="20"/>
+          <w:lang w:val="en-CA"/>
+        </w:rPr>
+      </w:pPr>
+      <w:r>
+        <w:rPr>
+          <w:rFonts w:ascii="Times" w:eastAsia="Times New Roman" w:hAnsi="Times" w:cs="Times New Roman"/>
+          <w:color w:val="000000"/>
+          <w:sz w:val="20"/>
+          <w:szCs w:val="20"/>
+          <w:lang w:val="en-CA"/>
+        </w:rPr>
+        <w:t>https://oceandata.sci.gsfc.nasa.gov/cgi/getfile/S20020012002365.L3m_YR_CHL_chlor_a_9km.nc</w:t>
+      </w:r>
+    </w:p>
+    <w:p/>
+    <w:p>
+      <w:r>
+        <w:t>ANNUAL LINKS</w:t>
+      </w:r>
+      <w:r>
+        <w:t>: MODIS AQUA</w:t>
+      </w:r>
+      <w:r>
+        <w:t xml:space="preserve"> 2002-2022</w:t>
+      </w:r>
+    </w:p>
+    <w:p>
+      <w:pPr>
+        <w:rPr>
+          <w:rFonts w:ascii="Times New Roman" w:hAnsi="Times New Roman" w:cs="Times New Roman"/>
+          <w:sz w:val="20"/>
+          <w:szCs w:val="20"/>
+        </w:rPr>
+      </w:pPr>
+      <w:r>
+        <w:rPr>
+          <w:rFonts w:ascii="Times New Roman" w:hAnsi="Times New Roman" w:cs="Times New Roman"/>
+          <w:sz w:val="20"/>
+          <w:szCs w:val="20"/>
+        </w:rPr>
+        <w:t>https://oceandata.sci.gsfc.nasa.gov/cgi/getfile/A20020012002365.L3m_YR_CHL_chlor_a_4km.nc</w:t>
+      </w:r>
+    </w:p>
+    <w:p>
+      <w:pPr>
+        <w:rPr>
+          <w:rFonts w:ascii="Times New Roman" w:hAnsi="Times New Roman" w:cs="Times New Roman"/>
+          <w:sz w:val="20"/>
+          <w:szCs w:val="20"/>
+        </w:rPr>
+      </w:pPr>
+      <w:r>
+        <w:rPr>
+          <w:rFonts w:ascii="Times New Roman" w:hAnsi="Times New Roman" w:cs="Times New Roman"/>
+          <w:sz w:val="20"/>
+          <w:szCs w:val="20"/>
+        </w:rPr>
+        <w:t>https://oceandata.sci.gsfc.nasa.gov/cgi/getfile/A20030012003365.L3m_YR_CHL_chlor_a_4km.nc</w:t>
+      </w:r>
+    </w:p>
+    <w:p>
+      <w:pPr>
+        <w:rPr>
+          <w:rFonts w:ascii="Times New Roman" w:hAnsi="Times New Roman" w:cs="Times New Roman"/>
+          <w:sz w:val="20"/>
+          <w:szCs w:val="20"/>
+        </w:rPr>
+      </w:pPr>
+      <w:r>
+        <w:rPr>
+          <w:rFonts w:ascii="Times New Roman" w:hAnsi="Times New Roman" w:cs="Times New Roman"/>
+          <w:sz w:val="20"/>
+          <w:szCs w:val="20"/>
+        </w:rPr>
+        <w:t>https://oceandata.sci.gsfc.nasa.gov/cgi/getfile/A20040012004366.L3m_YR_CHL_chlor_a_4km.nc</w:t>
+      </w:r>
+    </w:p>
+    <w:p>
+      <w:pPr>
+        <w:rPr>
+          <w:rFonts w:ascii="Times New Roman" w:hAnsi="Times New Roman" w:cs="Times New Roman"/>
+          <w:sz w:val="20"/>
+          <w:szCs w:val="20"/>
+        </w:rPr>
+      </w:pPr>
+      <w:r>
+        <w:rPr>
+          <w:rFonts w:ascii="Times New Roman" w:hAnsi="Times New Roman" w:cs="Times New Roman"/>
+          <w:sz w:val="20"/>
+          <w:szCs w:val="20"/>
+        </w:rPr>
+        <w:t>https://oceandata.sci.gsfc.nasa.gov/cgi/getfile/A20050012005365.L3m_YR_CHL_chlor_a_4km.nc</w:t>
+      </w:r>
+    </w:p>
+    <w:p>
+      <w:pPr>
+        <w:rPr>
+          <w:rFonts w:ascii="Times New Roman" w:hAnsi="Times New Roman" w:cs="Times New Roman"/>
+          <w:sz w:val="20"/>
+          <w:szCs w:val="20"/>
+        </w:rPr>
+      </w:pPr>
+      <w:r>
+        <w:rPr>
+          <w:rFonts w:ascii="Times New Roman" w:hAnsi="Times New Roman" w:cs="Times New Roman"/>
+          <w:sz w:val="20"/>
+          <w:szCs w:val="20"/>
+        </w:rPr>
+        <w:t>https://oceandata.sci.gsfc.nasa.gov/cgi/getfile/A20060012006365.L3m_YR_CHL_chlor_a_4km.nc</w:t>
+      </w:r>
+    </w:p>
+    <w:p>
+      <w:pPr>
+        <w:rPr>
+          <w:rFonts w:ascii="Times New Roman" w:hAnsi="Times New Roman" w:cs="Times New Roman"/>
+          <w:sz w:val="20"/>
+          <w:szCs w:val="20"/>
+        </w:rPr>
+      </w:pPr>
+      <w:r>
+        <w:rPr>
+          <w:rFonts w:ascii="Times New Roman" w:hAnsi="Times New Roman" w:cs="Times New Roman"/>
+          <w:sz w:val="20"/>
+          <w:szCs w:val="20"/>
+        </w:rPr>
+        <w:t>https://oceandata.sci.gsfc.nasa.gov/cgi/getfile/A20070012007365.L3m_YR_CHL_chlor_a_4km.nc</w:t>
+      </w:r>
+    </w:p>
+    <w:p>
+      <w:pPr>
+        <w:rPr>
+          <w:rFonts w:ascii="Times New Roman" w:hAnsi="Times New Roman" w:cs="Times New Roman"/>
+          <w:sz w:val="20"/>
+          <w:szCs w:val="20"/>
+        </w:rPr>
+      </w:pPr>
+      <w:r>
+        <w:rPr>
+          <w:rFonts w:ascii="Times New Roman" w:hAnsi="Times New Roman" w:cs="Times New Roman"/>
+          <w:sz w:val="20"/>
+          <w:szCs w:val="20"/>
+        </w:rPr>
+        <w:t>https://oceandata.sci.gsfc.nasa.gov/cgi/getfile/A20080012008366.L3m_YR_CHL_chlor_a_4km.nc</w:t>
+      </w:r>
+    </w:p>
+    <w:p>
+      <w:pPr>
+        <w:rPr>
+          <w:rFonts w:ascii="Times New Roman" w:hAnsi="Times New Roman" w:cs="Times New Roman"/>
+          <w:sz w:val="20"/>
+          <w:szCs w:val="20"/>
+        </w:rPr>
+      </w:pPr>
+      <w:r>
+        <w:rPr>
+          <w:rFonts w:ascii="Times New Roman" w:hAnsi="Times New Roman" w:cs="Times New Roman"/>
+          <w:sz w:val="20"/>
+          <w:szCs w:val="20"/>
         </w:rPr>
         <w:lastRenderedPageBreak/>
-        <w:t>https://oceandata.sci.gsfc.nasa.gov/cgi/getfile/A20153552016080.L3m_SNWI_CHL_chlor_a_4km.nc</w:t>
-      </w:r>
-      <w:r>
-        <w:rPr>
-          <w:rFonts w:ascii="Times" w:eastAsia="Times New Roman" w:hAnsi="Times" w:cs="Times New Roman"/>
-          <w:color w:val="000000"/>
-          <w:sz w:val="20"/>
-          <w:szCs w:val="20"/>
-          <w:lang w:val="en-CA"/>
-        </w:rPr>
-        <w:br/>
-        <w:t>https://oceandata.sci.gsfc.nasa.gov/cgi/getfile/A20160812016172.L3m_SNSP_CHL_chlor_a_4km.nc</w:t>
-      </w:r>
-      <w:r>
-        <w:rPr>
-          <w:rFonts w:ascii="Times" w:eastAsia="Times New Roman" w:hAnsi="Times" w:cs="Times New Roman"/>
-          <w:color w:val="000000"/>
-          <w:sz w:val="20"/>
-          <w:szCs w:val="20"/>
-          <w:lang w:val="en-CA"/>
-        </w:rPr>
-        <w:br/>
-        <w:t>https://oceandata.sci.gsfc.nasa.gov/cgi/getfile/A20161732016264.L3m_SNSU_CHL_chlor_a_4km.nc</w:t>
-      </w:r>
-      <w:r>
-        <w:rPr>
-          <w:rFonts w:ascii="Times" w:eastAsia="Times New Roman" w:hAnsi="Times" w:cs="Times New Roman"/>
-          <w:color w:val="000000"/>
-          <w:sz w:val="20"/>
-          <w:szCs w:val="20"/>
-          <w:lang w:val="en-CA"/>
-        </w:rPr>
-        <w:br/>
-        <w:t>https://oceandata.sci.gsfc.nasa.gov/cgi/getfile/A20162652016355.L3m_SNAU_CHL_chlor_a_4km.nc</w:t>
-      </w:r>
-      <w:r>
-        <w:rPr>
-          <w:rFonts w:ascii="Times" w:eastAsia="Times New Roman" w:hAnsi="Times" w:cs="Times New Roman"/>
-          <w:color w:val="000000"/>
-          <w:sz w:val="20"/>
-          <w:szCs w:val="20"/>
-          <w:lang w:val="en-CA"/>
-        </w:rPr>
-        <w:br/>
-        <w:t>https://oceandata.sci.gsfc.nasa.gov/cgi/getfile/A20163562017079.L3m_SNWI_CHL_chlor_a_4km.nc</w:t>
-      </w:r>
-      <w:r>
-        <w:rPr>
-          <w:rFonts w:ascii="Times" w:eastAsia="Times New Roman" w:hAnsi="Times" w:cs="Times New Roman"/>
-          <w:color w:val="000000"/>
-          <w:sz w:val="20"/>
-          <w:szCs w:val="20"/>
-          <w:lang w:val="en-CA"/>
-        </w:rPr>
-        <w:br/>
-        <w:t>https://oceandata.sci.gsfc.nasa.gov/cgi/getfile/A20170802017171.L3m_SNSP_CHL_chlor_a_4km.nc</w:t>
-      </w:r>
-      <w:r>
-        <w:rPr>
-          <w:rFonts w:ascii="Times" w:eastAsia="Times New Roman" w:hAnsi="Times" w:cs="Times New Roman"/>
-          <w:color w:val="000000"/>
-          <w:sz w:val="20"/>
-          <w:szCs w:val="20"/>
-          <w:lang w:val="en-CA"/>
-        </w:rPr>
-        <w:br/>
-        <w:t>https://oceandata.sci.gsfc.nasa.gov/cgi/getfile/A20171722017263.L3m_SNSU_CHL_chlor_a_4km.nc</w:t>
-      </w:r>
-      <w:r>
-        <w:rPr>
-          <w:rFonts w:ascii="Times" w:eastAsia="Times New Roman" w:hAnsi="Times" w:cs="Times New Roman"/>
-          <w:color w:val="000000"/>
-          <w:sz w:val="20"/>
-          <w:szCs w:val="20"/>
-          <w:lang w:val="en-CA"/>
-        </w:rPr>
-        <w:br/>
-        <w:t>https://oceandata.sci.gsfc.nasa.gov/cgi/getfile/A20172642017354.L3m_SNAU_CHL_chlor_a_4km.nc</w:t>
-      </w:r>
-      <w:r>
-        <w:rPr>
-          <w:rFonts w:ascii="Times" w:eastAsia="Times New Roman" w:hAnsi="Times" w:cs="Times New Roman"/>
-          <w:color w:val="000000"/>
-          <w:sz w:val="20"/>
-          <w:szCs w:val="20"/>
-          <w:lang w:val="en-CA"/>
-        </w:rPr>
-        <w:br/>
-        <w:t>https://oceandata.sci.gsfc.nasa.gov/cgi/getfile/A20173552018079.L3m_SNWI_CHL_chlor_a_4km.nc</w:t>
-      </w:r>
-      <w:r>
-        <w:rPr>
-          <w:rFonts w:ascii="Times" w:eastAsia="Times New Roman" w:hAnsi="Times" w:cs="Times New Roman"/>
-          <w:color w:val="000000"/>
-          <w:sz w:val="20"/>
-          <w:szCs w:val="20"/>
-          <w:lang w:val="en-CA"/>
-        </w:rPr>
-        <w:br/>
-        <w:t>https://oceandata.sci.gsfc.nasa.gov/cgi/getfile/A20180802018171.L3m_SNSP_CHL_chlor_a_4km.nc</w:t>
-      </w:r>
-      <w:r>
-        <w:rPr>
-          <w:rFonts w:ascii="Times" w:eastAsia="Times New Roman" w:hAnsi="Times" w:cs="Times New Roman"/>
-          <w:color w:val="000000"/>
-          <w:sz w:val="20"/>
-          <w:szCs w:val="20"/>
-          <w:lang w:val="en-CA"/>
-        </w:rPr>
-        <w:br/>
-        <w:t>https://oceandata.sci.gsfc.nasa.gov/cgi/getfile/A20181722018263.L3m_SNSU_CHL_chlor_a_4km.nc</w:t>
-      </w:r>
-      <w:r>
-        <w:rPr>
-          <w:rFonts w:ascii="Times" w:eastAsia="Times New Roman" w:hAnsi="Times" w:cs="Times New Roman"/>
-          <w:color w:val="000000"/>
-          <w:sz w:val="20"/>
-          <w:szCs w:val="20"/>
-          <w:lang w:val="en-CA"/>
-        </w:rPr>
-        <w:br/>
-        <w:t>https://oceandata.sci.gsfc.nasa.gov/cgi/getfile/A20182642018354.L3m_SNAU_CHL_chlor_a_4km.nc</w:t>
-      </w:r>
-      <w:r>
-        <w:rPr>
-          <w:rFonts w:ascii="Times" w:eastAsia="Times New Roman" w:hAnsi="Times" w:cs="Times New Roman"/>
-          <w:color w:val="000000"/>
-          <w:sz w:val="20"/>
-          <w:szCs w:val="20"/>
-          <w:lang w:val="en-CA"/>
-        </w:rPr>
-        <w:br/>
-        <w:t>https://oceandata.sci.gsfc.nasa.gov/cgi/getfile/A20183552019079.L3m_SNWI_CHL_chlor_a_4km.nc</w:t>
-      </w:r>
-      <w:r>
-        <w:rPr>
-          <w:rFonts w:ascii="Times" w:eastAsia="Times New Roman" w:hAnsi="Times" w:cs="Times New Roman"/>
-          <w:color w:val="000000"/>
-          <w:sz w:val="20"/>
-          <w:szCs w:val="20"/>
-          <w:lang w:val="en-CA"/>
-        </w:rPr>
-        <w:br/>
-        <w:t>https://oceandata.sci.gsfc.nasa.gov/cgi/getfile/A20190802019171.L3m_SNSP_CHL_chlor_a_4km.nc</w:t>
-      </w:r>
-      <w:r>
-        <w:rPr>
-          <w:rFonts w:ascii="Times" w:eastAsia="Times New Roman" w:hAnsi="Times" w:cs="Times New Roman"/>
-          <w:color w:val="000000"/>
-          <w:sz w:val="20"/>
-          <w:szCs w:val="20"/>
-          <w:lang w:val="en-CA"/>
-        </w:rPr>
-        <w:br/>
-        <w:t>https://oceandata.sci.gsfc.nasa.gov/cgi/getfile/A20191722019263.L3m_SNSU_CHL_chlor_a_4km.nc</w:t>
-      </w:r>
-      <w:r>
-        <w:rPr>
-          <w:rFonts w:ascii="Times" w:eastAsia="Times New Roman" w:hAnsi="Times" w:cs="Times New Roman"/>
-          <w:color w:val="000000"/>
-          <w:sz w:val="20"/>
-          <w:szCs w:val="20"/>
-          <w:lang w:val="en-CA"/>
-        </w:rPr>
-        <w:br/>
-        <w:t>https://oceandata.sci.gsfc.nasa.gov/cgi/getfile/A20192642019354.L3m_SNAU_CHL_chlor_a_4km.nc</w:t>
-      </w:r>
-      <w:r>
-        <w:rPr>
-          <w:rFonts w:ascii="Times" w:eastAsia="Times New Roman" w:hAnsi="Times" w:cs="Times New Roman"/>
-          <w:color w:val="000000"/>
-          <w:sz w:val="20"/>
-          <w:szCs w:val="20"/>
-          <w:lang w:val="en-CA"/>
-        </w:rPr>
-        <w:br/>
-        <w:t>https://oceandata.sci.gsfc.nasa.gov/cgi/getfile/A20193552020080.L3m_SNWI_CHL_chlor_a_4km.nc</w:t>
-      </w:r>
-      <w:r>
-        <w:rPr>
-          <w:rFonts w:ascii="Times" w:eastAsia="Times New Roman" w:hAnsi="Times" w:cs="Times New Roman"/>
-          <w:color w:val="000000"/>
-          <w:sz w:val="20"/>
-          <w:szCs w:val="20"/>
-          <w:lang w:val="en-CA"/>
-        </w:rPr>
-        <w:br/>
-        <w:t>https://oceandata.sci.gsfc.nasa.gov/cgi/getfile/A20200812020172.L3m_SNSP_CHL_chlor_a_4km.nc</w:t>
-      </w:r>
-      <w:r>
-        <w:rPr>
-          <w:rFonts w:ascii="Times" w:eastAsia="Times New Roman" w:hAnsi="Times" w:cs="Times New Roman"/>
-          <w:color w:val="000000"/>
-          <w:sz w:val="20"/>
-          <w:szCs w:val="20"/>
-          <w:lang w:val="en-CA"/>
-        </w:rPr>
-        <w:br/>
-        <w:t>https://oceandata.sci.gsfc.nasa.gov/cgi/getfile/A20201732020264.L3m_SNSU_CHL_chlor_a_4km.nc</w:t>
-      </w:r>
-      <w:r>
-        <w:rPr>
-          <w:rFonts w:ascii="Times" w:eastAsia="Times New Roman" w:hAnsi="Times" w:cs="Times New Roman"/>
-          <w:color w:val="000000"/>
-          <w:sz w:val="20"/>
-          <w:szCs w:val="20"/>
-          <w:lang w:val="en-CA"/>
-        </w:rPr>
-        <w:br/>
-        <w:t>https://oceandata.sci.gsfc.nasa.gov/cgi/getfile/A20202652020355.L3m_SNAU_CHL_chlor_a_4km.nc</w:t>
-      </w:r>
-      <w:r>
-        <w:rPr>
-          <w:rFonts w:ascii="Times" w:eastAsia="Times New Roman" w:hAnsi="Times" w:cs="Times New Roman"/>
-          <w:color w:val="000000"/>
-          <w:sz w:val="20"/>
-          <w:szCs w:val="20"/>
-          <w:lang w:val="en-CA"/>
-        </w:rPr>
-        <w:br/>
-        <w:t>https://oceandata.sci.gsfc.nasa.gov/cgi/getfile/A20203562021079.L3m_SNWI_CHL_chlor_a_4km.nc</w:t>
-      </w:r>
-    </w:p>
-    <w:p/>
-    <w:p/>
-    <w:p/>
-    <w:p>
-      <w:r>
-        <w:t>ANNUAL LINKS</w:t>
-      </w:r>
-    </w:p>
-    <w:p>
-      <w:pPr>
-        <w:rPr>
-          <w:rFonts w:ascii="Times New Roman" w:hAnsi="Times New Roman" w:cs="Times New Roman"/>
-          <w:sz w:val="20"/>
-          <w:szCs w:val="20"/>
-        </w:rPr>
-      </w:pPr>
-      <w:r>
-        <w:rPr>
-          <w:rFonts w:ascii="Times New Roman" w:hAnsi="Times New Roman" w:cs="Times New Roman"/>
-          <w:sz w:val="20"/>
-          <w:szCs w:val="20"/>
-        </w:rPr>
-        <w:t>https://oceandata.sci.gsfc.nasa.gov/cgi/getfile/A20020012002365.L3m_YR_CHL_chlor_a_4km.nc</w:t>
-      </w:r>
-    </w:p>
-    <w:p>
-      <w:pPr>
-        <w:rPr>
-          <w:rFonts w:ascii="Times New Roman" w:hAnsi="Times New Roman" w:cs="Times New Roman"/>
-          <w:sz w:val="20"/>
-          <w:szCs w:val="20"/>
-        </w:rPr>
-      </w:pPr>
-      <w:r>
-        <w:rPr>
-          <w:rFonts w:ascii="Times New Roman" w:hAnsi="Times New Roman" w:cs="Times New Roman"/>
-          <w:sz w:val="20"/>
-          <w:szCs w:val="20"/>
-        </w:rPr>
-        <w:t>https://oceandata.sci.gsfc.nasa.gov/cgi/getfile/A20030012003365.L3m_YR_CHL_chlor_a_4km.nc</w:t>
-      </w:r>
-    </w:p>
-    <w:p>
-      <w:pPr>
-        <w:rPr>
-          <w:rFonts w:ascii="Times New Roman" w:hAnsi="Times New Roman" w:cs="Times New Roman"/>
-          <w:sz w:val="20"/>
-          <w:szCs w:val="20"/>
-        </w:rPr>
-      </w:pPr>
-      <w:r>
-        <w:rPr>
-          <w:rFonts w:ascii="Times New Roman" w:hAnsi="Times New Roman" w:cs="Times New Roman"/>
-          <w:sz w:val="20"/>
-          <w:szCs w:val="20"/>
-        </w:rPr>
-        <w:t>https://oceandata.sci.gsfc.nasa.gov/cgi/getfile/A20040012004366.L3m_YR_CHL_chlor_a_4km.nc</w:t>
-      </w:r>
-    </w:p>
-    <w:p>
-      <w:pPr>
-        <w:rPr>
-          <w:rFonts w:ascii="Times New Roman" w:hAnsi="Times New Roman" w:cs="Times New Roman"/>
-          <w:sz w:val="20"/>
-          <w:szCs w:val="20"/>
-        </w:rPr>
-      </w:pPr>
-      <w:r>
-        <w:rPr>
-          <w:rFonts w:ascii="Times New Roman" w:hAnsi="Times New Roman" w:cs="Times New Roman"/>
-          <w:sz w:val="20"/>
-          <w:szCs w:val="20"/>
-        </w:rPr>
-        <w:t>https://oceandata.sci.gsfc.nasa.gov/cgi/getfile/A20050012005365.L3m_YR_CHL_chlor_a_4km.nc</w:t>
-      </w:r>
-    </w:p>
-    <w:p>
-      <w:pPr>
-        <w:rPr>
-          <w:rFonts w:ascii="Times New Roman" w:hAnsi="Times New Roman" w:cs="Times New Roman"/>
-          <w:sz w:val="20"/>
-          <w:szCs w:val="20"/>
-        </w:rPr>
-      </w:pPr>
-      <w:r>
-        <w:rPr>
-          <w:rFonts w:ascii="Times New Roman" w:hAnsi="Times New Roman" w:cs="Times New Roman"/>
-          <w:sz w:val="20"/>
-          <w:szCs w:val="20"/>
-        </w:rPr>
-        <w:t>https://oceandata.sci.gsfc.nasa.gov/cgi/getfile/A20060012006365.L3m_YR_CHL_chlor_a_4km.nc</w:t>
-      </w:r>
-    </w:p>
-    <w:p>
-      <w:pPr>
-        <w:rPr>
-          <w:rFonts w:ascii="Times New Roman" w:hAnsi="Times New Roman" w:cs="Times New Roman"/>
-          <w:sz w:val="20"/>
-          <w:szCs w:val="20"/>
-        </w:rPr>
-      </w:pPr>
-      <w:r>
-        <w:rPr>
-          <w:rFonts w:ascii="Times New Roman" w:hAnsi="Times New Roman" w:cs="Times New Roman"/>
-          <w:sz w:val="20"/>
-          <w:szCs w:val="20"/>
-        </w:rPr>
-        <w:t>https://oceandata.sci.gsfc.nasa.gov/cgi/getfile/A20070012007365.L3m_YR_CHL_chlor_a_4km.nc</w:t>
-      </w:r>
-    </w:p>
-    <w:p>
-      <w:pPr>
-        <w:rPr>
-          <w:rFonts w:ascii="Times New Roman" w:hAnsi="Times New Roman" w:cs="Times New Roman"/>
-          <w:sz w:val="20"/>
-          <w:szCs w:val="20"/>
-        </w:rPr>
-      </w:pPr>
-      <w:r>
-        <w:rPr>
-          <w:rFonts w:ascii="Times New Roman" w:hAnsi="Times New Roman" w:cs="Times New Roman"/>
-          <w:sz w:val="20"/>
-          <w:szCs w:val="20"/>
-        </w:rPr>
-        <w:t>https://oceandata.sci.gsfc.nasa.gov/cgi/getfile/A20080012008366.L3m_YR_CHL_chlor_a_4km.nc</w:t>
-      </w:r>
-    </w:p>
-    <w:p>
-      <w:pPr>
-        <w:rPr>
-          <w:rFonts w:ascii="Times New Roman" w:hAnsi="Times New Roman" w:cs="Times New Roman"/>
-          <w:sz w:val="20"/>
-          <w:szCs w:val="20"/>
-        </w:rPr>
-      </w:pPr>
-      <w:r>
-        <w:rPr>
-          <w:rFonts w:ascii="Times New Roman" w:hAnsi="Times New Roman" w:cs="Times New Roman"/>
-          <w:sz w:val="20"/>
-          <w:szCs w:val="20"/>
-        </w:rPr>
         <w:t>https://oceandata.sci.gsfc.nasa.gov/cgi/getfile/A20090012009365.L3m_YR_CHL_chlor_a_4km.nc</w:t>
       </w:r>
     </w:p>
@@ -1261,7 +2751,6 @@
           <w:szCs w:val="20"/>
         </w:rPr>
       </w:pPr>
-      <w:bookmarkStart w:id="0" w:name="_GoBack"/>
       <w:r>
         <w:rPr>
           <w:rFonts w:ascii="Times New Roman" w:hAnsi="Times New Roman" w:cs="Times New Roman"/>
@@ -1270,7 +2759,24 @@
         </w:rPr>
         <w:t>https://oceandata.sci.gsfc.nasa.gov/cgi/getfile/A20021852021031.L3m_CU_CHL_chlor_a_4km.nc</w:t>
       </w:r>
-      <w:bookmarkEnd w:id="0"/>
+    </w:p>
+    <w:p>
+      <w:pPr>
+        <w:rPr>
+          <w:rFonts w:ascii="Times New Roman" w:hAnsi="Times New Roman" w:cs="Times New Roman"/>
+          <w:sz w:val="20"/>
+          <w:szCs w:val="20"/>
+        </w:rPr>
+      </w:pPr>
+    </w:p>
+    <w:p>
+      <w:pPr>
+        <w:rPr>
+          <w:rFonts w:ascii="Times New Roman" w:hAnsi="Times New Roman" w:cs="Times New Roman"/>
+          <w:sz w:val="20"/>
+          <w:szCs w:val="20"/>
+        </w:rPr>
+      </w:pPr>
     </w:p>
     <w:sectPr>
       <w:pgSz w:w="12240" w:h="15840"/>

</xml_diff>

<commit_message>
organize the chl a download links
</commit_message>
<xml_diff>
--- a/chl_a_download_links.docx
+++ b/chl_a_download_links.docx
@@ -705,404 +705,404 @@
           <w:szCs w:val="20"/>
           <w:lang w:val="en-CA"/>
         </w:rPr>
-        <w:t xml:space="preserve"> 1997</w:t>
-      </w:r>
-      <w:r>
-        <w:rPr>
-          <w:rFonts w:ascii="Times New Roman" w:eastAsia="Times New Roman" w:hAnsi="Times New Roman" w:cs="Times New Roman"/>
+        <w:t xml:space="preserve"> 1997-2002</w:t>
+      </w:r>
+    </w:p>
+    <w:p>
+      <w:pPr>
+        <w:rPr>
+          <w:rFonts w:ascii="Times New Roman" w:eastAsia="Times New Roman" w:hAnsi="Times New Roman" w:cs="Times New Roman"/>
+          <w:sz w:val="20"/>
+          <w:szCs w:val="20"/>
+          <w:lang w:val="en-CA"/>
+        </w:rPr>
+      </w:pPr>
+      <w:r>
+        <w:rPr>
+          <w:rFonts w:ascii="Times New Roman" w:eastAsia="Times New Roman" w:hAnsi="Times New Roman" w:cs="Times New Roman"/>
+          <w:sz w:val="20"/>
+          <w:szCs w:val="20"/>
+          <w:lang w:val="en-CA"/>
+        </w:rPr>
+        <w:t>https://oceandata.sci.gsfc.nasa.gov/cgi/getfile/S19971721997263.L3m_SNSU_CHL_chlor_a_9km.nc</w:t>
+      </w:r>
+    </w:p>
+    <w:p>
+      <w:pPr>
+        <w:rPr>
+          <w:rFonts w:ascii="Times New Roman" w:eastAsia="Times New Roman" w:hAnsi="Times New Roman" w:cs="Times New Roman"/>
+          <w:sz w:val="20"/>
+          <w:szCs w:val="20"/>
+          <w:lang w:val="en-CA"/>
+        </w:rPr>
+      </w:pPr>
+      <w:r>
+        <w:rPr>
+          <w:rFonts w:ascii="Times New Roman" w:eastAsia="Times New Roman" w:hAnsi="Times New Roman" w:cs="Times New Roman"/>
+          <w:sz w:val="20"/>
+          <w:szCs w:val="20"/>
+          <w:lang w:val="en-CA"/>
+        </w:rPr>
+        <w:t>https://oceandata.sci.gsfc.nasa.gov/cgi/getfile/S19972641997354.L3m_SNAU_CHL_chlor_a_9km.nc</w:t>
+      </w:r>
+    </w:p>
+    <w:p>
+      <w:pPr>
+        <w:rPr>
+          <w:rFonts w:ascii="Times New Roman" w:eastAsia="Times New Roman" w:hAnsi="Times New Roman" w:cs="Times New Roman"/>
+          <w:sz w:val="20"/>
+          <w:szCs w:val="20"/>
+          <w:lang w:val="en-CA"/>
+        </w:rPr>
+      </w:pPr>
+      <w:r>
+        <w:rPr>
+          <w:rFonts w:ascii="Times New Roman" w:eastAsia="Times New Roman" w:hAnsi="Times New Roman" w:cs="Times New Roman"/>
+          <w:sz w:val="20"/>
+          <w:szCs w:val="20"/>
+          <w:lang w:val="en-CA"/>
+        </w:rPr>
+        <w:t>https://oceandata.sci.gsfc.nasa.gov/cgi/getfile/S19973551998079.L3m_SNWI_CHL_chlor_a_9km.nc</w:t>
+      </w:r>
+    </w:p>
+    <w:p>
+      <w:pPr>
+        <w:rPr>
+          <w:rFonts w:ascii="Times New Roman" w:eastAsia="Times New Roman" w:hAnsi="Times New Roman" w:cs="Times New Roman"/>
+          <w:sz w:val="20"/>
+          <w:szCs w:val="20"/>
+          <w:lang w:val="en-CA"/>
+        </w:rPr>
+      </w:pPr>
+      <w:r>
+        <w:rPr>
+          <w:rFonts w:ascii="Times New Roman" w:eastAsia="Times New Roman" w:hAnsi="Times New Roman" w:cs="Times New Roman"/>
+          <w:sz w:val="20"/>
+          <w:szCs w:val="20"/>
+          <w:lang w:val="en-CA"/>
+        </w:rPr>
+        <w:t>https://oceandata.sci.gsfc.nasa.gov/cgi/getfile/S19980801998171.L3m_SNSP_CHL_chlor_a_9km.nc</w:t>
+      </w:r>
+    </w:p>
+    <w:p>
+      <w:pPr>
+        <w:rPr>
+          <w:rFonts w:ascii="Times New Roman" w:eastAsia="Times New Roman" w:hAnsi="Times New Roman" w:cs="Times New Roman"/>
+          <w:sz w:val="20"/>
+          <w:szCs w:val="20"/>
+          <w:lang w:val="en-CA"/>
+        </w:rPr>
+      </w:pPr>
+      <w:r>
+        <w:rPr>
+          <w:rFonts w:ascii="Times New Roman" w:eastAsia="Times New Roman" w:hAnsi="Times New Roman" w:cs="Times New Roman"/>
+          <w:sz w:val="20"/>
+          <w:szCs w:val="20"/>
+          <w:lang w:val="en-CA"/>
+        </w:rPr>
+        <w:t>https://oceandata.sci.gsfc.nasa.gov/cgi/getfile/S19981721998263.L3m_SNSU_CHL_chlor_a_9km.nc</w:t>
+      </w:r>
+    </w:p>
+    <w:p>
+      <w:pPr>
+        <w:rPr>
+          <w:rFonts w:ascii="Times New Roman" w:eastAsia="Times New Roman" w:hAnsi="Times New Roman" w:cs="Times New Roman"/>
+          <w:sz w:val="20"/>
+          <w:szCs w:val="20"/>
+          <w:lang w:val="en-CA"/>
+        </w:rPr>
+      </w:pPr>
+      <w:r>
+        <w:rPr>
+          <w:rFonts w:ascii="Times New Roman" w:eastAsia="Times New Roman" w:hAnsi="Times New Roman" w:cs="Times New Roman"/>
+          <w:sz w:val="20"/>
+          <w:szCs w:val="20"/>
+          <w:lang w:val="en-CA"/>
+        </w:rPr>
+        <w:t>https://oceandata.sci.gsfc.nasa.gov/cgi/getfile/S19982641998354.L3m_SNAU_CHL_chlor_a_9km.nc</w:t>
+      </w:r>
+    </w:p>
+    <w:p>
+      <w:pPr>
+        <w:rPr>
+          <w:rFonts w:ascii="Times New Roman" w:eastAsia="Times New Roman" w:hAnsi="Times New Roman" w:cs="Times New Roman"/>
+          <w:sz w:val="20"/>
+          <w:szCs w:val="20"/>
+          <w:lang w:val="en-CA"/>
+        </w:rPr>
+      </w:pPr>
+      <w:r>
+        <w:rPr>
+          <w:rFonts w:ascii="Times New Roman" w:eastAsia="Times New Roman" w:hAnsi="Times New Roman" w:cs="Times New Roman"/>
+          <w:sz w:val="20"/>
+          <w:szCs w:val="20"/>
+          <w:lang w:val="en-CA"/>
+        </w:rPr>
+        <w:t>https://oceandata.sci.gsfc.nasa.gov/cgi/getfile/S19983551999079.L3m_SNWI_CHL_chlor_a_9km.nc</w:t>
+      </w:r>
+    </w:p>
+    <w:p>
+      <w:pPr>
+        <w:rPr>
+          <w:rFonts w:ascii="Times New Roman" w:eastAsia="Times New Roman" w:hAnsi="Times New Roman" w:cs="Times New Roman"/>
+          <w:sz w:val="20"/>
+          <w:szCs w:val="20"/>
+          <w:lang w:val="en-CA"/>
+        </w:rPr>
+      </w:pPr>
+      <w:r>
+        <w:rPr>
+          <w:rFonts w:ascii="Times New Roman" w:eastAsia="Times New Roman" w:hAnsi="Times New Roman" w:cs="Times New Roman"/>
+          <w:sz w:val="20"/>
+          <w:szCs w:val="20"/>
+          <w:lang w:val="en-CA"/>
+        </w:rPr>
+        <w:t>https://oceandata.sci.gsfc.nasa.gov/cgi/getfile/S19990801999171.L3m_SNSP_CHL_chlor_a_9km.nc</w:t>
+      </w:r>
+    </w:p>
+    <w:p>
+      <w:pPr>
+        <w:rPr>
+          <w:rFonts w:ascii="Times New Roman" w:eastAsia="Times New Roman" w:hAnsi="Times New Roman" w:cs="Times New Roman"/>
+          <w:sz w:val="20"/>
+          <w:szCs w:val="20"/>
+          <w:lang w:val="en-CA"/>
+        </w:rPr>
+      </w:pPr>
+      <w:r>
+        <w:rPr>
+          <w:rFonts w:ascii="Times New Roman" w:eastAsia="Times New Roman" w:hAnsi="Times New Roman" w:cs="Times New Roman"/>
+          <w:sz w:val="20"/>
+          <w:szCs w:val="20"/>
+          <w:lang w:val="en-CA"/>
+        </w:rPr>
+        <w:t>https://oceandata.sci.gsfc.nasa.gov/cgi/getfile/S19991721999263.L3m_SNSU_CHL_chlor_a_9km.nc</w:t>
+      </w:r>
+    </w:p>
+    <w:p>
+      <w:pPr>
+        <w:rPr>
+          <w:rFonts w:ascii="Times New Roman" w:eastAsia="Times New Roman" w:hAnsi="Times New Roman" w:cs="Times New Roman"/>
+          <w:sz w:val="20"/>
+          <w:szCs w:val="20"/>
+          <w:lang w:val="en-CA"/>
+        </w:rPr>
+      </w:pPr>
+      <w:r>
+        <w:rPr>
+          <w:rFonts w:ascii="Times New Roman" w:eastAsia="Times New Roman" w:hAnsi="Times New Roman" w:cs="Times New Roman"/>
+          <w:sz w:val="20"/>
+          <w:szCs w:val="20"/>
+          <w:lang w:val="en-CA"/>
+        </w:rPr>
+        <w:t>https://oceandata.sci.gsfc.nasa.gov/cgi/getfile/S19992641999354.L3m_SNAU_CHL_chlor_a_9km.nc</w:t>
+      </w:r>
+    </w:p>
+    <w:p>
+      <w:pPr>
+        <w:rPr>
+          <w:rFonts w:ascii="Times New Roman" w:eastAsia="Times New Roman" w:hAnsi="Times New Roman" w:cs="Times New Roman"/>
+          <w:sz w:val="20"/>
+          <w:szCs w:val="20"/>
+          <w:lang w:val="en-CA"/>
+        </w:rPr>
+      </w:pPr>
+      <w:r>
+        <w:rPr>
+          <w:rFonts w:ascii="Times New Roman" w:eastAsia="Times New Roman" w:hAnsi="Times New Roman" w:cs="Times New Roman"/>
+          <w:sz w:val="20"/>
+          <w:szCs w:val="20"/>
+          <w:lang w:val="en-CA"/>
+        </w:rPr>
+        <w:t>https://oceandata.sci.gsfc.nasa.gov/cgi/getfile/S19993552000080.L3m_SNWI_CHL_chlor_a_9km.nc</w:t>
+      </w:r>
+    </w:p>
+    <w:p>
+      <w:pPr>
+        <w:rPr>
+          <w:rFonts w:ascii="Times New Roman" w:eastAsia="Times New Roman" w:hAnsi="Times New Roman" w:cs="Times New Roman"/>
+          <w:sz w:val="20"/>
+          <w:szCs w:val="20"/>
+          <w:lang w:val="en-CA"/>
+        </w:rPr>
+      </w:pPr>
+      <w:r>
+        <w:rPr>
+          <w:rFonts w:ascii="Times New Roman" w:eastAsia="Times New Roman" w:hAnsi="Times New Roman" w:cs="Times New Roman"/>
+          <w:sz w:val="20"/>
+          <w:szCs w:val="20"/>
+          <w:lang w:val="en-CA"/>
+        </w:rPr>
+        <w:t>https://oceandata.sci.gsfc.nasa.gov/cgi/getfile/S20000812000172.L3m_SNSP_CHL_chlor_a_9km.nc</w:t>
+      </w:r>
+    </w:p>
+    <w:p>
+      <w:pPr>
+        <w:rPr>
+          <w:rFonts w:ascii="Times New Roman" w:eastAsia="Times New Roman" w:hAnsi="Times New Roman" w:cs="Times New Roman"/>
+          <w:sz w:val="20"/>
+          <w:szCs w:val="20"/>
+          <w:lang w:val="en-CA"/>
+        </w:rPr>
+      </w:pPr>
+      <w:r>
+        <w:rPr>
+          <w:rFonts w:ascii="Times New Roman" w:eastAsia="Times New Roman" w:hAnsi="Times New Roman" w:cs="Times New Roman"/>
+          <w:sz w:val="20"/>
+          <w:szCs w:val="20"/>
+          <w:lang w:val="en-CA"/>
+        </w:rPr>
+        <w:t>https://oceandata.sci.gsfc.nasa.gov/cgi/getfile/S20001732000264.L3m_SNSU_CHL_chlor_a_9km.nc</w:t>
+      </w:r>
+    </w:p>
+    <w:p>
+      <w:pPr>
+        <w:rPr>
+          <w:rFonts w:ascii="Times New Roman" w:eastAsia="Times New Roman" w:hAnsi="Times New Roman" w:cs="Times New Roman"/>
+          <w:sz w:val="20"/>
+          <w:szCs w:val="20"/>
+          <w:lang w:val="en-CA"/>
+        </w:rPr>
+      </w:pPr>
+      <w:r>
+        <w:rPr>
+          <w:rFonts w:ascii="Times New Roman" w:eastAsia="Times New Roman" w:hAnsi="Times New Roman" w:cs="Times New Roman"/>
+          <w:sz w:val="20"/>
+          <w:szCs w:val="20"/>
+          <w:lang w:val="en-CA"/>
+        </w:rPr>
+        <w:t>https://oceandata.sci.gsfc.nasa.gov/cgi/getfile/S20002652000355.L3m_SNAU_CHL_chlor_a_9km.nc</w:t>
+      </w:r>
+    </w:p>
+    <w:p>
+      <w:pPr>
+        <w:rPr>
+          <w:rFonts w:ascii="Times New Roman" w:eastAsia="Times New Roman" w:hAnsi="Times New Roman" w:cs="Times New Roman"/>
+          <w:sz w:val="20"/>
+          <w:szCs w:val="20"/>
+          <w:lang w:val="en-CA"/>
+        </w:rPr>
+      </w:pPr>
+      <w:r>
+        <w:rPr>
+          <w:rFonts w:ascii="Times New Roman" w:eastAsia="Times New Roman" w:hAnsi="Times New Roman" w:cs="Times New Roman"/>
+          <w:sz w:val="20"/>
+          <w:szCs w:val="20"/>
+          <w:lang w:val="en-CA"/>
+        </w:rPr>
+        <w:t>https://oceandata.sci.gsfc.nasa.gov/cgi/getfile/S20003562001079.L3m_SNWI_CHL_chlor_a_9km.nc</w:t>
+      </w:r>
+    </w:p>
+    <w:p>
+      <w:pPr>
+        <w:rPr>
+          <w:rFonts w:ascii="Times New Roman" w:eastAsia="Times New Roman" w:hAnsi="Times New Roman" w:cs="Times New Roman"/>
+          <w:sz w:val="20"/>
+          <w:szCs w:val="20"/>
+          <w:lang w:val="en-CA"/>
+        </w:rPr>
+      </w:pPr>
+      <w:r>
+        <w:rPr>
+          <w:rFonts w:ascii="Times New Roman" w:eastAsia="Times New Roman" w:hAnsi="Times New Roman" w:cs="Times New Roman"/>
+          <w:sz w:val="20"/>
+          <w:szCs w:val="20"/>
+          <w:lang w:val="en-CA"/>
+        </w:rPr>
+        <w:t>https://oceandata.sci.gsfc.nasa.gov/cgi/getfile/S20010802001171.L3m_SNSP_CHL_chlor_a_9km.nc</w:t>
+      </w:r>
+    </w:p>
+    <w:p>
+      <w:pPr>
+        <w:rPr>
+          <w:rFonts w:ascii="Times New Roman" w:eastAsia="Times New Roman" w:hAnsi="Times New Roman" w:cs="Times New Roman"/>
+          <w:sz w:val="20"/>
+          <w:szCs w:val="20"/>
+          <w:lang w:val="en-CA"/>
+        </w:rPr>
+      </w:pPr>
+      <w:r>
+        <w:rPr>
+          <w:rFonts w:ascii="Times New Roman" w:eastAsia="Times New Roman" w:hAnsi="Times New Roman" w:cs="Times New Roman"/>
+          <w:sz w:val="20"/>
+          <w:szCs w:val="20"/>
+          <w:lang w:val="en-CA"/>
+        </w:rPr>
+        <w:lastRenderedPageBreak/>
+        <w:t>https://oceandata.sci.gsfc.nasa.gov/cgi/getfile/S20011722001263.L3m_SNSU_CHL_chlor_a_9km.nc</w:t>
+      </w:r>
+    </w:p>
+    <w:p>
+      <w:pPr>
+        <w:rPr>
+          <w:rFonts w:ascii="Times New Roman" w:eastAsia="Times New Roman" w:hAnsi="Times New Roman" w:cs="Times New Roman"/>
+          <w:sz w:val="20"/>
+          <w:szCs w:val="20"/>
+          <w:lang w:val="en-CA"/>
+        </w:rPr>
+      </w:pPr>
+      <w:r>
+        <w:rPr>
+          <w:rFonts w:ascii="Times New Roman" w:eastAsia="Times New Roman" w:hAnsi="Times New Roman" w:cs="Times New Roman"/>
+          <w:sz w:val="20"/>
+          <w:szCs w:val="20"/>
+          <w:lang w:val="en-CA"/>
+        </w:rPr>
+        <w:t>https://oceandata.sci.gsfc.nasa.gov/cgi/getfile/S20012642001354.L3m_SNAU_CHL_chlor_a_9km.nc</w:t>
+      </w:r>
+    </w:p>
+    <w:p>
+      <w:pPr>
+        <w:rPr>
+          <w:rFonts w:ascii="Times New Roman" w:eastAsia="Times New Roman" w:hAnsi="Times New Roman" w:cs="Times New Roman"/>
+          <w:sz w:val="20"/>
+          <w:szCs w:val="20"/>
+          <w:lang w:val="en-CA"/>
+        </w:rPr>
+      </w:pPr>
+      <w:r>
+        <w:rPr>
+          <w:rFonts w:ascii="Times New Roman" w:eastAsia="Times New Roman" w:hAnsi="Times New Roman" w:cs="Times New Roman"/>
+          <w:sz w:val="20"/>
+          <w:szCs w:val="20"/>
+          <w:lang w:val="en-CA"/>
+        </w:rPr>
+        <w:t>https://oceandata.sci.gsfc.nasa.gov/cgi/getfile/S20013552002079.L3m_SNWI_CHL_chlor_a_9km.nc</w:t>
+      </w:r>
+    </w:p>
+    <w:p>
+      <w:pPr>
+        <w:rPr>
+          <w:rFonts w:ascii="Times New Roman" w:eastAsia="Times New Roman" w:hAnsi="Times New Roman" w:cs="Times New Roman"/>
+          <w:sz w:val="20"/>
+          <w:szCs w:val="20"/>
+          <w:lang w:val="en-CA"/>
+        </w:rPr>
+      </w:pPr>
+      <w:r>
+        <w:rPr>
+          <w:rFonts w:ascii="Times New Roman" w:eastAsia="Times New Roman" w:hAnsi="Times New Roman" w:cs="Times New Roman"/>
+          <w:sz w:val="20"/>
+          <w:szCs w:val="20"/>
+          <w:lang w:val="en-CA"/>
+        </w:rPr>
+        <w:t>https://oceandata.sci.gsfc.nasa.gov/cgi/getfile/S20020802002171.L3m_SNSP_CHL_chlor_a_9km.nc</w:t>
+      </w:r>
+    </w:p>
+    <w:p/>
+    <w:p>
+      <w:pPr>
+        <w:rPr>
+          <w:rFonts w:ascii="Times" w:eastAsia="Times New Roman" w:hAnsi="Times" w:cs="Times New Roman"/>
           <w:b/>
           <w:bCs/>
-          <w:sz w:val="20"/>
-          <w:szCs w:val="20"/>
-          <w:lang w:val="en-CA"/>
-        </w:rPr>
-        <w:t>-2002</w:t>
-      </w:r>
-    </w:p>
-    <w:p>
-      <w:pPr>
-        <w:rPr>
-          <w:rFonts w:ascii="Times New Roman" w:eastAsia="Times New Roman" w:hAnsi="Times New Roman" w:cs="Times New Roman"/>
-          <w:sz w:val="20"/>
-          <w:szCs w:val="20"/>
-          <w:lang w:val="en-CA"/>
-        </w:rPr>
-      </w:pPr>
-      <w:r>
-        <w:rPr>
-          <w:rFonts w:ascii="Times New Roman" w:eastAsia="Times New Roman" w:hAnsi="Times New Roman" w:cs="Times New Roman"/>
-          <w:sz w:val="20"/>
-          <w:szCs w:val="20"/>
-          <w:lang w:val="en-CA"/>
-        </w:rPr>
-        <w:t>https://oceandata.sci.gsfc.nasa.gov/cgi/getfile/S19971721997263.L3m_SNSU_CHL_chlor_a_9km.nc</w:t>
-      </w:r>
-    </w:p>
-    <w:p>
-      <w:pPr>
-        <w:rPr>
-          <w:rFonts w:ascii="Times New Roman" w:eastAsia="Times New Roman" w:hAnsi="Times New Roman" w:cs="Times New Roman"/>
-          <w:sz w:val="20"/>
-          <w:szCs w:val="20"/>
-          <w:lang w:val="en-CA"/>
-        </w:rPr>
-      </w:pPr>
-      <w:r>
-        <w:rPr>
-          <w:rFonts w:ascii="Times New Roman" w:eastAsia="Times New Roman" w:hAnsi="Times New Roman" w:cs="Times New Roman"/>
-          <w:sz w:val="20"/>
-          <w:szCs w:val="20"/>
-          <w:lang w:val="en-CA"/>
-        </w:rPr>
-        <w:t>https://oceandata.sci.gsfc.nasa.gov/cgi/getfile/S19972641997354.L3m_SNAU_CHL_chlor_a_9km.nc</w:t>
-      </w:r>
-    </w:p>
-    <w:p>
-      <w:pPr>
-        <w:rPr>
-          <w:rFonts w:ascii="Times New Roman" w:eastAsia="Times New Roman" w:hAnsi="Times New Roman" w:cs="Times New Roman"/>
-          <w:sz w:val="20"/>
-          <w:szCs w:val="20"/>
-          <w:lang w:val="en-CA"/>
-        </w:rPr>
-      </w:pPr>
-      <w:r>
-        <w:rPr>
-          <w:rFonts w:ascii="Times New Roman" w:eastAsia="Times New Roman" w:hAnsi="Times New Roman" w:cs="Times New Roman"/>
-          <w:sz w:val="20"/>
-          <w:szCs w:val="20"/>
-          <w:lang w:val="en-CA"/>
-        </w:rPr>
-        <w:t>https://oceandata.sci.gsfc.nasa.gov/cgi/getfile/S19973551998079.L3m_SNWI_CHL_chlor_a_9km.nc</w:t>
-      </w:r>
-    </w:p>
-    <w:p>
-      <w:pPr>
-        <w:rPr>
-          <w:rFonts w:ascii="Times New Roman" w:eastAsia="Times New Roman" w:hAnsi="Times New Roman" w:cs="Times New Roman"/>
-          <w:sz w:val="20"/>
-          <w:szCs w:val="20"/>
-          <w:lang w:val="en-CA"/>
-        </w:rPr>
-      </w:pPr>
-      <w:r>
-        <w:rPr>
-          <w:rFonts w:ascii="Times New Roman" w:eastAsia="Times New Roman" w:hAnsi="Times New Roman" w:cs="Times New Roman"/>
-          <w:sz w:val="20"/>
-          <w:szCs w:val="20"/>
-          <w:lang w:val="en-CA"/>
-        </w:rPr>
-        <w:t>https://oceandata.sci.gsfc.nasa.gov/cgi/getfile/S19980801998171.L3m_SNSP_CHL_chlor_a_9km.nc</w:t>
-      </w:r>
-    </w:p>
-    <w:p>
-      <w:pPr>
-        <w:rPr>
-          <w:rFonts w:ascii="Times New Roman" w:eastAsia="Times New Roman" w:hAnsi="Times New Roman" w:cs="Times New Roman"/>
-          <w:sz w:val="20"/>
-          <w:szCs w:val="20"/>
-          <w:lang w:val="en-CA"/>
-        </w:rPr>
-      </w:pPr>
-      <w:r>
-        <w:rPr>
-          <w:rFonts w:ascii="Times New Roman" w:eastAsia="Times New Roman" w:hAnsi="Times New Roman" w:cs="Times New Roman"/>
-          <w:sz w:val="20"/>
-          <w:szCs w:val="20"/>
-          <w:lang w:val="en-CA"/>
-        </w:rPr>
-        <w:t>https://oceandata.sci.gsfc.nasa.gov/cgi/getfile/S19981721998263.L3m_SNSU_CHL_chlor_a_9km.nc</w:t>
-      </w:r>
-    </w:p>
-    <w:p>
-      <w:pPr>
-        <w:rPr>
-          <w:rFonts w:ascii="Times New Roman" w:eastAsia="Times New Roman" w:hAnsi="Times New Roman" w:cs="Times New Roman"/>
-          <w:sz w:val="20"/>
-          <w:szCs w:val="20"/>
-          <w:lang w:val="en-CA"/>
-        </w:rPr>
-      </w:pPr>
-      <w:r>
-        <w:rPr>
-          <w:rFonts w:ascii="Times New Roman" w:eastAsia="Times New Roman" w:hAnsi="Times New Roman" w:cs="Times New Roman"/>
-          <w:sz w:val="20"/>
-          <w:szCs w:val="20"/>
-          <w:lang w:val="en-CA"/>
-        </w:rPr>
-        <w:t>https://oceandata.sci.gsfc.nasa.gov/cgi/getfile/S19982641998354.L3m_SNAU_CHL_chlor_a_9km.nc</w:t>
-      </w:r>
-    </w:p>
-    <w:p>
-      <w:pPr>
-        <w:rPr>
-          <w:rFonts w:ascii="Times New Roman" w:eastAsia="Times New Roman" w:hAnsi="Times New Roman" w:cs="Times New Roman"/>
-          <w:sz w:val="20"/>
-          <w:szCs w:val="20"/>
-          <w:lang w:val="en-CA"/>
-        </w:rPr>
-      </w:pPr>
-      <w:r>
-        <w:rPr>
-          <w:rFonts w:ascii="Times New Roman" w:eastAsia="Times New Roman" w:hAnsi="Times New Roman" w:cs="Times New Roman"/>
-          <w:sz w:val="20"/>
-          <w:szCs w:val="20"/>
-          <w:lang w:val="en-CA"/>
-        </w:rPr>
-        <w:t>https://oceandata.sci.gsfc.nasa.gov/cgi/getfile/S19983551999079.L3m_SNWI_CHL_chlor_a_9km.nc</w:t>
-      </w:r>
-    </w:p>
-    <w:p>
-      <w:pPr>
-        <w:rPr>
-          <w:rFonts w:ascii="Times New Roman" w:eastAsia="Times New Roman" w:hAnsi="Times New Roman" w:cs="Times New Roman"/>
-          <w:sz w:val="20"/>
-          <w:szCs w:val="20"/>
-          <w:lang w:val="en-CA"/>
-        </w:rPr>
-      </w:pPr>
-      <w:r>
-        <w:rPr>
-          <w:rFonts w:ascii="Times New Roman" w:eastAsia="Times New Roman" w:hAnsi="Times New Roman" w:cs="Times New Roman"/>
-          <w:sz w:val="20"/>
-          <w:szCs w:val="20"/>
-          <w:lang w:val="en-CA"/>
-        </w:rPr>
-        <w:t>https://oceandata.sci.gsfc.nasa.gov/cgi/getfile/S19990801999171.L3m_SNSP_CHL_chlor_a_9km.nc</w:t>
-      </w:r>
-    </w:p>
-    <w:p>
-      <w:pPr>
-        <w:rPr>
-          <w:rFonts w:ascii="Times New Roman" w:eastAsia="Times New Roman" w:hAnsi="Times New Roman" w:cs="Times New Roman"/>
-          <w:sz w:val="20"/>
-          <w:szCs w:val="20"/>
-          <w:lang w:val="en-CA"/>
-        </w:rPr>
-      </w:pPr>
-      <w:r>
-        <w:rPr>
-          <w:rFonts w:ascii="Times New Roman" w:eastAsia="Times New Roman" w:hAnsi="Times New Roman" w:cs="Times New Roman"/>
-          <w:sz w:val="20"/>
-          <w:szCs w:val="20"/>
-          <w:lang w:val="en-CA"/>
-        </w:rPr>
-        <w:t>https://oceandata.sci.gsfc.nasa.gov/cgi/getfile/S19991721999263.L3m_SNSU_CHL_chlor_a_9km.nc</w:t>
-      </w:r>
-    </w:p>
-    <w:p>
-      <w:pPr>
-        <w:rPr>
-          <w:rFonts w:ascii="Times New Roman" w:eastAsia="Times New Roman" w:hAnsi="Times New Roman" w:cs="Times New Roman"/>
-          <w:sz w:val="20"/>
-          <w:szCs w:val="20"/>
-          <w:lang w:val="en-CA"/>
-        </w:rPr>
-      </w:pPr>
-      <w:r>
-        <w:rPr>
-          <w:rFonts w:ascii="Times New Roman" w:eastAsia="Times New Roman" w:hAnsi="Times New Roman" w:cs="Times New Roman"/>
-          <w:sz w:val="20"/>
-          <w:szCs w:val="20"/>
-          <w:lang w:val="en-CA"/>
-        </w:rPr>
-        <w:t>https://oceandata.sci.gsfc.nasa.gov/cgi/getfile/S19992641999354.L3m_SNAU_CHL_chlor_a_9km.nc</w:t>
-      </w:r>
-    </w:p>
-    <w:p>
-      <w:pPr>
-        <w:rPr>
-          <w:rFonts w:ascii="Times New Roman" w:eastAsia="Times New Roman" w:hAnsi="Times New Roman" w:cs="Times New Roman"/>
-          <w:sz w:val="20"/>
-          <w:szCs w:val="20"/>
-          <w:lang w:val="en-CA"/>
-        </w:rPr>
-      </w:pPr>
-      <w:r>
-        <w:rPr>
-          <w:rFonts w:ascii="Times New Roman" w:eastAsia="Times New Roman" w:hAnsi="Times New Roman" w:cs="Times New Roman"/>
-          <w:sz w:val="20"/>
-          <w:szCs w:val="20"/>
-          <w:lang w:val="en-CA"/>
-        </w:rPr>
-        <w:t>https://oceandata.sci.gsfc.nasa.gov/cgi/getfile/S19993552000080.L3m_SNWI_CHL_chlor_a_9km.nc</w:t>
-      </w:r>
-    </w:p>
-    <w:p>
-      <w:pPr>
-        <w:rPr>
-          <w:rFonts w:ascii="Times New Roman" w:eastAsia="Times New Roman" w:hAnsi="Times New Roman" w:cs="Times New Roman"/>
-          <w:sz w:val="20"/>
-          <w:szCs w:val="20"/>
-          <w:lang w:val="en-CA"/>
-        </w:rPr>
-      </w:pPr>
-      <w:r>
-        <w:rPr>
-          <w:rFonts w:ascii="Times New Roman" w:eastAsia="Times New Roman" w:hAnsi="Times New Roman" w:cs="Times New Roman"/>
-          <w:sz w:val="20"/>
-          <w:szCs w:val="20"/>
-          <w:lang w:val="en-CA"/>
-        </w:rPr>
-        <w:t>https://oceandata.sci.gsfc.nasa.gov/cgi/getfile/S20000812000172.L3m_SNSP_CHL_chlor_a_9km.nc</w:t>
-      </w:r>
-    </w:p>
-    <w:p>
-      <w:pPr>
-        <w:rPr>
-          <w:rFonts w:ascii="Times New Roman" w:eastAsia="Times New Roman" w:hAnsi="Times New Roman" w:cs="Times New Roman"/>
-          <w:sz w:val="20"/>
-          <w:szCs w:val="20"/>
-          <w:lang w:val="en-CA"/>
-        </w:rPr>
-      </w:pPr>
-      <w:r>
-        <w:rPr>
-          <w:rFonts w:ascii="Times New Roman" w:eastAsia="Times New Roman" w:hAnsi="Times New Roman" w:cs="Times New Roman"/>
-          <w:sz w:val="20"/>
-          <w:szCs w:val="20"/>
-          <w:lang w:val="en-CA"/>
-        </w:rPr>
-        <w:t>https://oceandata.sci.gsfc.nasa.gov/cgi/getfile/S20001732000264.L3m_SNSU_CHL_chlor_a_9km.nc</w:t>
-      </w:r>
-    </w:p>
-    <w:p>
-      <w:pPr>
-        <w:rPr>
-          <w:rFonts w:ascii="Times New Roman" w:eastAsia="Times New Roman" w:hAnsi="Times New Roman" w:cs="Times New Roman"/>
-          <w:sz w:val="20"/>
-          <w:szCs w:val="20"/>
-          <w:lang w:val="en-CA"/>
-        </w:rPr>
-      </w:pPr>
-      <w:r>
-        <w:rPr>
-          <w:rFonts w:ascii="Times New Roman" w:eastAsia="Times New Roman" w:hAnsi="Times New Roman" w:cs="Times New Roman"/>
-          <w:sz w:val="20"/>
-          <w:szCs w:val="20"/>
-          <w:lang w:val="en-CA"/>
-        </w:rPr>
-        <w:t>https://oceandata.sci.gsfc.nasa.gov/cgi/getfile/S20002652000355.L3m_SNAU_CHL_chlor_a_9km.nc</w:t>
-      </w:r>
-    </w:p>
-    <w:p>
-      <w:pPr>
-        <w:rPr>
-          <w:rFonts w:ascii="Times New Roman" w:eastAsia="Times New Roman" w:hAnsi="Times New Roman" w:cs="Times New Roman"/>
-          <w:sz w:val="20"/>
-          <w:szCs w:val="20"/>
-          <w:lang w:val="en-CA"/>
-        </w:rPr>
-      </w:pPr>
-      <w:r>
-        <w:rPr>
-          <w:rFonts w:ascii="Times New Roman" w:eastAsia="Times New Roman" w:hAnsi="Times New Roman" w:cs="Times New Roman"/>
-          <w:sz w:val="20"/>
-          <w:szCs w:val="20"/>
-          <w:lang w:val="en-CA"/>
-        </w:rPr>
-        <w:t>https://oceandata.sci.gsfc.nasa.gov/cgi/getfile/S20003562001079.L3m_SNWI_CHL_chlor_a_9km.nc</w:t>
-      </w:r>
-    </w:p>
-    <w:p>
-      <w:pPr>
-        <w:rPr>
-          <w:rFonts w:ascii="Times New Roman" w:eastAsia="Times New Roman" w:hAnsi="Times New Roman" w:cs="Times New Roman"/>
-          <w:sz w:val="20"/>
-          <w:szCs w:val="20"/>
-          <w:lang w:val="en-CA"/>
-        </w:rPr>
-      </w:pPr>
-      <w:r>
-        <w:rPr>
-          <w:rFonts w:ascii="Times New Roman" w:eastAsia="Times New Roman" w:hAnsi="Times New Roman" w:cs="Times New Roman"/>
-          <w:sz w:val="20"/>
-          <w:szCs w:val="20"/>
-          <w:lang w:val="en-CA"/>
-        </w:rPr>
-        <w:t>https://oceandata.sci.gsfc.nasa.gov/cgi/getfile/S20010802001171.L3m_SNSP_CHL_chlor_a_9km.nc</w:t>
-      </w:r>
-    </w:p>
-    <w:p>
-      <w:pPr>
-        <w:rPr>
-          <w:rFonts w:ascii="Times New Roman" w:eastAsia="Times New Roman" w:hAnsi="Times New Roman" w:cs="Times New Roman"/>
-          <w:sz w:val="20"/>
-          <w:szCs w:val="20"/>
-          <w:lang w:val="en-CA"/>
-        </w:rPr>
-      </w:pPr>
-      <w:r>
-        <w:rPr>
-          <w:rFonts w:ascii="Times New Roman" w:eastAsia="Times New Roman" w:hAnsi="Times New Roman" w:cs="Times New Roman"/>
-          <w:sz w:val="20"/>
-          <w:szCs w:val="20"/>
-          <w:lang w:val="en-CA"/>
-        </w:rPr>
-        <w:lastRenderedPageBreak/>
-        <w:t>https://oceandata.sci.gsfc.nasa.gov/cgi/getfile/S20011722001263.L3m_SNSU_CHL_chlor_a_9km.nc</w:t>
-      </w:r>
-    </w:p>
-    <w:p>
-      <w:pPr>
-        <w:rPr>
-          <w:rFonts w:ascii="Times New Roman" w:eastAsia="Times New Roman" w:hAnsi="Times New Roman" w:cs="Times New Roman"/>
-          <w:sz w:val="20"/>
-          <w:szCs w:val="20"/>
-          <w:lang w:val="en-CA"/>
-        </w:rPr>
-      </w:pPr>
-      <w:r>
-        <w:rPr>
-          <w:rFonts w:ascii="Times New Roman" w:eastAsia="Times New Roman" w:hAnsi="Times New Roman" w:cs="Times New Roman"/>
-          <w:sz w:val="20"/>
-          <w:szCs w:val="20"/>
-          <w:lang w:val="en-CA"/>
-        </w:rPr>
-        <w:t>https://oceandata.sci.gsfc.nasa.gov/cgi/getfile/S20012642001354.L3m_SNAU_CHL_chlor_a_9km.nc</w:t>
-      </w:r>
-    </w:p>
-    <w:p>
-      <w:pPr>
-        <w:rPr>
-          <w:rFonts w:ascii="Times New Roman" w:eastAsia="Times New Roman" w:hAnsi="Times New Roman" w:cs="Times New Roman"/>
-          <w:sz w:val="20"/>
-          <w:szCs w:val="20"/>
-          <w:lang w:val="en-CA"/>
-        </w:rPr>
-      </w:pPr>
-      <w:r>
-        <w:rPr>
-          <w:rFonts w:ascii="Times New Roman" w:eastAsia="Times New Roman" w:hAnsi="Times New Roman" w:cs="Times New Roman"/>
-          <w:sz w:val="20"/>
-          <w:szCs w:val="20"/>
-          <w:lang w:val="en-CA"/>
-        </w:rPr>
-        <w:t>https://oceandata.sci.gsfc.nasa.gov/cgi/getfile/S20013552002079.L3m_SNWI_CHL_chlor_a_9km.nc</w:t>
-      </w:r>
-    </w:p>
-    <w:p>
-      <w:pPr>
-        <w:rPr>
-          <w:rFonts w:ascii="Times New Roman" w:eastAsia="Times New Roman" w:hAnsi="Times New Roman" w:cs="Times New Roman"/>
-          <w:sz w:val="20"/>
-          <w:szCs w:val="20"/>
-          <w:lang w:val="en-CA"/>
-        </w:rPr>
-      </w:pPr>
-      <w:r>
-        <w:rPr>
-          <w:rFonts w:ascii="Times New Roman" w:eastAsia="Times New Roman" w:hAnsi="Times New Roman" w:cs="Times New Roman"/>
-          <w:sz w:val="20"/>
-          <w:szCs w:val="20"/>
-          <w:lang w:val="en-CA"/>
-        </w:rPr>
-        <w:t>https://oceandata.sci.gsfc.nasa.gov/cgi/getfile/S20020802002171.L3m_SNSP_CHL_chlor_a_9km.nc</w:t>
-      </w:r>
-    </w:p>
-    <w:p/>
-    <w:p>
-      <w:pPr>
+          <w:color w:val="000000"/>
+          <w:sz w:val="20"/>
+          <w:szCs w:val="20"/>
+          <w:lang w:val="en-CA"/>
+        </w:rPr>
+      </w:pPr>
+      <w:r>
         <w:rPr>
           <w:rFonts w:ascii="Times" w:eastAsia="Times New Roman" w:hAnsi="Times" w:cs="Times New Roman"/>
           <w:b/>
@@ -1112,7 +1112,8 @@
           <w:szCs w:val="20"/>
           <w:lang w:val="en-CA"/>
         </w:rPr>
-      </w:pPr>
+        <w:t>SEASONAL LINKS: MODIS AQUA</w:t>
+      </w:r>
       <w:r>
         <w:rPr>
           <w:rFonts w:ascii="Times" w:eastAsia="Times New Roman" w:hAnsi="Times" w:cs="Times New Roman"/>
@@ -1123,18 +1124,6 @@
           <w:szCs w:val="20"/>
           <w:lang w:val="en-CA"/>
         </w:rPr>
-        <w:t>SEASONAL LINKS: MODIS AQUA</w:t>
-      </w:r>
-      <w:r>
-        <w:rPr>
-          <w:rFonts w:ascii="Times" w:eastAsia="Times New Roman" w:hAnsi="Times" w:cs="Times New Roman"/>
-          <w:b/>
-          <w:bCs/>
-          <w:color w:val="000000"/>
-          <w:sz w:val="20"/>
-          <w:szCs w:val="20"/>
-          <w:lang w:val="en-CA"/>
-        </w:rPr>
         <w:t xml:space="preserve"> 2002-2022</w:t>
       </w:r>
     </w:p>
@@ -1996,235 +1985,221 @@
     </w:p>
     <w:p>
       <w:r>
+        <w:t>ANNUAL LINKS: CZCS 1978-1986</w:t>
+      </w:r>
+    </w:p>
+    <w:p>
+      <w:pPr>
+        <w:rPr>
+          <w:rFonts w:ascii="Times" w:eastAsia="Times New Roman" w:hAnsi="Times" w:cs="Times New Roman"/>
+          <w:color w:val="000000"/>
+          <w:sz w:val="20"/>
+          <w:szCs w:val="20"/>
+          <w:lang w:val="en-CA"/>
+        </w:rPr>
+      </w:pPr>
+      <w:r>
+        <w:rPr>
+          <w:rFonts w:ascii="Times" w:eastAsia="Times New Roman" w:hAnsi="Times" w:cs="Times New Roman"/>
+          <w:color w:val="000000"/>
+          <w:sz w:val="20"/>
+          <w:szCs w:val="20"/>
+          <w:lang w:val="en-CA"/>
+        </w:rPr>
+        <w:t>https://oceandata.sci.gsfc.nasa.gov/cgi/getfile/C19780011978365.L3m_YR_CHL_chl_ocx_4km.nc</w:t>
+      </w:r>
+    </w:p>
+    <w:p>
+      <w:pPr>
+        <w:rPr>
+          <w:rFonts w:ascii="Times" w:eastAsia="Times New Roman" w:hAnsi="Times" w:cs="Times New Roman"/>
+          <w:color w:val="000000"/>
+          <w:sz w:val="20"/>
+          <w:szCs w:val="20"/>
+          <w:lang w:val="en-CA"/>
+        </w:rPr>
+      </w:pPr>
+      <w:r>
+        <w:rPr>
+          <w:rFonts w:ascii="Times" w:eastAsia="Times New Roman" w:hAnsi="Times" w:cs="Times New Roman"/>
+          <w:color w:val="000000"/>
+          <w:sz w:val="20"/>
+          <w:szCs w:val="20"/>
+          <w:lang w:val="en-CA"/>
+        </w:rPr>
+        <w:t>https://oceandata.sci.gsfc.nasa.gov/cgi/getfile/C19790011979365.L3m_YR_CHL_chl_ocx_4km.nc</w:t>
+      </w:r>
+    </w:p>
+    <w:p>
+      <w:pPr>
+        <w:rPr>
+          <w:rFonts w:ascii="Times" w:eastAsia="Times New Roman" w:hAnsi="Times" w:cs="Times New Roman"/>
+          <w:color w:val="000000"/>
+          <w:sz w:val="20"/>
+          <w:szCs w:val="20"/>
+          <w:lang w:val="en-CA"/>
+        </w:rPr>
+      </w:pPr>
+      <w:r>
+        <w:rPr>
+          <w:rFonts w:ascii="Times" w:eastAsia="Times New Roman" w:hAnsi="Times" w:cs="Times New Roman"/>
+          <w:color w:val="000000"/>
+          <w:sz w:val="20"/>
+          <w:szCs w:val="20"/>
+          <w:lang w:val="en-CA"/>
+        </w:rPr>
+        <w:t>https://oceandata.sci.gsfc.nasa.gov/cgi/getfile/C19800011980366.L3m_YR_CHL_chl_ocx_4km.nc</w:t>
+      </w:r>
+    </w:p>
+    <w:p>
+      <w:pPr>
+        <w:rPr>
+          <w:rFonts w:ascii="Times" w:eastAsia="Times New Roman" w:hAnsi="Times" w:cs="Times New Roman"/>
+          <w:color w:val="000000"/>
+          <w:sz w:val="20"/>
+          <w:szCs w:val="20"/>
+          <w:lang w:val="en-CA"/>
+        </w:rPr>
+      </w:pPr>
+      <w:r>
+        <w:rPr>
+          <w:rFonts w:ascii="Times" w:eastAsia="Times New Roman" w:hAnsi="Times" w:cs="Times New Roman"/>
+          <w:color w:val="000000"/>
+          <w:sz w:val="20"/>
+          <w:szCs w:val="20"/>
+          <w:lang w:val="en-CA"/>
+        </w:rPr>
+        <w:t>https://oceandata.sci.gsfc.nasa.gov/cgi/getfile/C19810011981365.L3m_YR_CHL_chl_ocx_4km.nc</w:t>
+      </w:r>
+    </w:p>
+    <w:p>
+      <w:pPr>
+        <w:rPr>
+          <w:rFonts w:ascii="Times" w:eastAsia="Times New Roman" w:hAnsi="Times" w:cs="Times New Roman"/>
+          <w:color w:val="000000"/>
+          <w:sz w:val="20"/>
+          <w:szCs w:val="20"/>
+          <w:lang w:val="en-CA"/>
+        </w:rPr>
+      </w:pPr>
+      <w:r>
+        <w:rPr>
+          <w:rFonts w:ascii="Times" w:eastAsia="Times New Roman" w:hAnsi="Times" w:cs="Times New Roman"/>
+          <w:color w:val="000000"/>
+          <w:sz w:val="20"/>
+          <w:szCs w:val="20"/>
+          <w:lang w:val="en-CA"/>
+        </w:rPr>
+        <w:t>https://oceandata.sci.gsfc.nasa.gov/cgi/getfile/C19820011982365.L3m_YR_CHL_chl_ocx_4km.nc</w:t>
+      </w:r>
+    </w:p>
+    <w:p>
+      <w:pPr>
+        <w:rPr>
+          <w:rFonts w:ascii="Times" w:eastAsia="Times New Roman" w:hAnsi="Times" w:cs="Times New Roman"/>
+          <w:color w:val="000000"/>
+          <w:sz w:val="20"/>
+          <w:szCs w:val="20"/>
+          <w:lang w:val="en-CA"/>
+        </w:rPr>
+      </w:pPr>
+      <w:r>
+        <w:rPr>
+          <w:rFonts w:ascii="Times" w:eastAsia="Times New Roman" w:hAnsi="Times" w:cs="Times New Roman"/>
+          <w:color w:val="000000"/>
+          <w:sz w:val="20"/>
+          <w:szCs w:val="20"/>
+          <w:lang w:val="en-CA"/>
+        </w:rPr>
+        <w:t>https://oceandata.sci.gsfc.nasa.gov/cgi/getfile/C19830011983365.L3m_YR_CHL_chl_ocx_4km.nc</w:t>
+      </w:r>
+    </w:p>
+    <w:p>
+      <w:pPr>
+        <w:rPr>
+          <w:rFonts w:ascii="Times" w:eastAsia="Times New Roman" w:hAnsi="Times" w:cs="Times New Roman"/>
+          <w:color w:val="000000"/>
+          <w:sz w:val="20"/>
+          <w:szCs w:val="20"/>
+          <w:lang w:val="en-CA"/>
+        </w:rPr>
+      </w:pPr>
+      <w:r>
+        <w:rPr>
+          <w:rFonts w:ascii="Times" w:eastAsia="Times New Roman" w:hAnsi="Times" w:cs="Times New Roman"/>
+          <w:color w:val="000000"/>
+          <w:sz w:val="20"/>
+          <w:szCs w:val="20"/>
+          <w:lang w:val="en-CA"/>
+        </w:rPr>
+        <w:t>https://oceandata.sci.gsfc.nasa.gov/cgi/getfile/C19840011984366.L3m_YR_CHL_chl_ocx_4km.nc</w:t>
+      </w:r>
+    </w:p>
+    <w:p>
+      <w:pPr>
+        <w:rPr>
+          <w:rFonts w:ascii="Times" w:eastAsia="Times New Roman" w:hAnsi="Times" w:cs="Times New Roman"/>
+          <w:color w:val="000000"/>
+          <w:sz w:val="20"/>
+          <w:szCs w:val="20"/>
+          <w:lang w:val="en-CA"/>
+        </w:rPr>
+      </w:pPr>
+      <w:r>
+        <w:rPr>
+          <w:rFonts w:ascii="Times" w:eastAsia="Times New Roman" w:hAnsi="Times" w:cs="Times New Roman"/>
+          <w:color w:val="000000"/>
+          <w:sz w:val="20"/>
+          <w:szCs w:val="20"/>
+          <w:lang w:val="en-CA"/>
+        </w:rPr>
+        <w:t>https://oceandata.sci.gsfc.nasa.gov/cgi/getfile/C19850011985365.L3m_YR_CHL_chl_ocx_4km.nc</w:t>
+      </w:r>
+    </w:p>
+    <w:p>
+      <w:pPr>
+        <w:rPr>
+          <w:rFonts w:ascii="Times" w:eastAsia="Times New Roman" w:hAnsi="Times" w:cs="Times New Roman"/>
+          <w:color w:val="000000"/>
+          <w:sz w:val="20"/>
+          <w:szCs w:val="20"/>
+          <w:lang w:val="en-CA"/>
+        </w:rPr>
+      </w:pPr>
+      <w:r>
+        <w:rPr>
+          <w:rFonts w:ascii="Times" w:eastAsia="Times New Roman" w:hAnsi="Times" w:cs="Times New Roman"/>
+          <w:color w:val="000000"/>
+          <w:sz w:val="20"/>
+          <w:szCs w:val="20"/>
+          <w:lang w:val="en-CA"/>
+        </w:rPr>
+        <w:t>https://oceandata.sci.gsfc.nasa.gov/cgi/getfile/C19860011986365.L3m_YR_CHL_chl_ocx_4km.nc</w:t>
+      </w:r>
+    </w:p>
+    <w:p>
+      <w:pPr>
+        <w:rPr>
+          <w:rFonts w:ascii="Times" w:eastAsia="Times New Roman" w:hAnsi="Times" w:cs="Times New Roman"/>
+          <w:color w:val="000000"/>
+          <w:sz w:val="20"/>
+          <w:szCs w:val="20"/>
+          <w:lang w:val="en-CA"/>
+        </w:rPr>
+      </w:pPr>
+    </w:p>
+    <w:p>
+      <w:r>
         <w:t xml:space="preserve">ANNUAL LINKS: </w:t>
       </w:r>
-      <w:r>
-        <w:t>CZCS</w:t>
-      </w:r>
-      <w:r>
-        <w:t xml:space="preserve"> </w:t>
-      </w:r>
-      <w:r>
-        <w:t>1978-1986</w:t>
-      </w:r>
-    </w:p>
-    <w:p>
-      <w:pPr>
-        <w:rPr>
-          <w:rFonts w:ascii="Times" w:eastAsia="Times New Roman" w:hAnsi="Times" w:cs="Times New Roman"/>
-          <w:color w:val="000000"/>
-          <w:sz w:val="20"/>
-          <w:szCs w:val="20"/>
-          <w:lang w:val="en-CA"/>
-        </w:rPr>
-      </w:pPr>
-      <w:r>
-        <w:rPr>
-          <w:rFonts w:ascii="Times" w:eastAsia="Times New Roman" w:hAnsi="Times" w:cs="Times New Roman"/>
-          <w:color w:val="000000"/>
-          <w:sz w:val="20"/>
-          <w:szCs w:val="20"/>
-          <w:lang w:val="en-CA"/>
-        </w:rPr>
-        <w:t>https://oceandata.sci.gsfc.nasa.gov/cgi/getfile/C19780011978365.L3m_YR_CHL_chl_ocx_4km.nc</w:t>
-      </w:r>
-    </w:p>
-    <w:p>
-      <w:pPr>
-        <w:rPr>
-          <w:rFonts w:ascii="Times" w:eastAsia="Times New Roman" w:hAnsi="Times" w:cs="Times New Roman"/>
-          <w:color w:val="000000"/>
-          <w:sz w:val="20"/>
-          <w:szCs w:val="20"/>
-          <w:lang w:val="en-CA"/>
-        </w:rPr>
-      </w:pPr>
-      <w:r>
-        <w:rPr>
-          <w:rFonts w:ascii="Times" w:eastAsia="Times New Roman" w:hAnsi="Times" w:cs="Times New Roman"/>
-          <w:color w:val="000000"/>
-          <w:sz w:val="20"/>
-          <w:szCs w:val="20"/>
-          <w:lang w:val="en-CA"/>
-        </w:rPr>
-        <w:t>https://oceandata.sci.gsfc.nasa.gov/cgi/getfile/C19790011979365.L3m_YR_CHL_chl_ocx_4km.nc</w:t>
-      </w:r>
-    </w:p>
-    <w:p>
-      <w:pPr>
-        <w:rPr>
-          <w:rFonts w:ascii="Times" w:eastAsia="Times New Roman" w:hAnsi="Times" w:cs="Times New Roman"/>
-          <w:color w:val="000000"/>
-          <w:sz w:val="20"/>
-          <w:szCs w:val="20"/>
-          <w:lang w:val="en-CA"/>
-        </w:rPr>
-      </w:pPr>
-      <w:r>
-        <w:rPr>
-          <w:rFonts w:ascii="Times" w:eastAsia="Times New Roman" w:hAnsi="Times" w:cs="Times New Roman"/>
-          <w:color w:val="000000"/>
-          <w:sz w:val="20"/>
-          <w:szCs w:val="20"/>
-          <w:lang w:val="en-CA"/>
-        </w:rPr>
-        <w:t>https://oceandata.sci.gsfc.nasa.gov/cgi/getfile/C19800011980366.L3m_YR_CHL_chl_ocx_4km.nc</w:t>
-      </w:r>
-    </w:p>
-    <w:p>
-      <w:pPr>
-        <w:rPr>
-          <w:rFonts w:ascii="Times" w:eastAsia="Times New Roman" w:hAnsi="Times" w:cs="Times New Roman"/>
-          <w:color w:val="000000"/>
-          <w:sz w:val="20"/>
-          <w:szCs w:val="20"/>
-          <w:lang w:val="en-CA"/>
-        </w:rPr>
-      </w:pPr>
-      <w:r>
-        <w:rPr>
-          <w:rFonts w:ascii="Times" w:eastAsia="Times New Roman" w:hAnsi="Times" w:cs="Times New Roman"/>
-          <w:color w:val="000000"/>
-          <w:sz w:val="20"/>
-          <w:szCs w:val="20"/>
-          <w:lang w:val="en-CA"/>
-        </w:rPr>
-        <w:t>https://oceandata.sci.gsfc.nasa.gov/cgi/getfile/C19810011981365.L3m_YR_CHL_chl_ocx_4km.nc</w:t>
-      </w:r>
-    </w:p>
-    <w:p>
-      <w:pPr>
-        <w:rPr>
-          <w:rFonts w:ascii="Times" w:eastAsia="Times New Roman" w:hAnsi="Times" w:cs="Times New Roman"/>
-          <w:color w:val="000000"/>
-          <w:sz w:val="20"/>
-          <w:szCs w:val="20"/>
-          <w:lang w:val="en-CA"/>
-        </w:rPr>
-      </w:pPr>
-      <w:r>
-        <w:rPr>
-          <w:rFonts w:ascii="Times" w:eastAsia="Times New Roman" w:hAnsi="Times" w:cs="Times New Roman"/>
-          <w:color w:val="000000"/>
-          <w:sz w:val="20"/>
-          <w:szCs w:val="20"/>
-          <w:lang w:val="en-CA"/>
-        </w:rPr>
-        <w:t>https://oceandata.sci.gsfc.nasa.gov/cgi/getfile/C19820011982365.L3m_YR_CHL_chl_ocx_4km.nc</w:t>
-      </w:r>
-    </w:p>
-    <w:p>
-      <w:pPr>
-        <w:rPr>
-          <w:rFonts w:ascii="Times" w:eastAsia="Times New Roman" w:hAnsi="Times" w:cs="Times New Roman"/>
-          <w:color w:val="000000"/>
-          <w:sz w:val="20"/>
-          <w:szCs w:val="20"/>
-          <w:lang w:val="en-CA"/>
-        </w:rPr>
-      </w:pPr>
-      <w:r>
-        <w:rPr>
-          <w:rFonts w:ascii="Times" w:eastAsia="Times New Roman" w:hAnsi="Times" w:cs="Times New Roman"/>
-          <w:color w:val="000000"/>
-          <w:sz w:val="20"/>
-          <w:szCs w:val="20"/>
-          <w:lang w:val="en-CA"/>
-        </w:rPr>
-        <w:t>https://oceandata.sci.gsfc.nasa.gov/cgi/getfile/C19830011983365.L3m_YR_CHL_chl_ocx_4km.nc</w:t>
-      </w:r>
-    </w:p>
-    <w:p>
-      <w:pPr>
-        <w:rPr>
-          <w:rFonts w:ascii="Times" w:eastAsia="Times New Roman" w:hAnsi="Times" w:cs="Times New Roman"/>
-          <w:color w:val="000000"/>
-          <w:sz w:val="20"/>
-          <w:szCs w:val="20"/>
-          <w:lang w:val="en-CA"/>
-        </w:rPr>
-      </w:pPr>
-      <w:r>
-        <w:rPr>
-          <w:rFonts w:ascii="Times" w:eastAsia="Times New Roman" w:hAnsi="Times" w:cs="Times New Roman"/>
-          <w:color w:val="000000"/>
-          <w:sz w:val="20"/>
-          <w:szCs w:val="20"/>
-          <w:lang w:val="en-CA"/>
-        </w:rPr>
-        <w:t>https://oceandata.sci.gsfc.nasa.gov/cgi/getfile/C19840011984366.L3m_YR_CHL_chl_ocx_4km.nc</w:t>
-      </w:r>
-    </w:p>
-    <w:p>
-      <w:pPr>
-        <w:rPr>
-          <w:rFonts w:ascii="Times" w:eastAsia="Times New Roman" w:hAnsi="Times" w:cs="Times New Roman"/>
-          <w:color w:val="000000"/>
-          <w:sz w:val="20"/>
-          <w:szCs w:val="20"/>
-          <w:lang w:val="en-CA"/>
-        </w:rPr>
-      </w:pPr>
-      <w:r>
-        <w:rPr>
-          <w:rFonts w:ascii="Times" w:eastAsia="Times New Roman" w:hAnsi="Times" w:cs="Times New Roman"/>
-          <w:color w:val="000000"/>
-          <w:sz w:val="20"/>
-          <w:szCs w:val="20"/>
-          <w:lang w:val="en-CA"/>
-        </w:rPr>
-        <w:t>https://oceandata.sci.gsfc.nasa.gov/cgi/getfile/C19850011985365.L3m_YR_CHL_chl_ocx_4km.nc</w:t>
-      </w:r>
-    </w:p>
-    <w:p>
-      <w:pPr>
-        <w:rPr>
-          <w:rFonts w:ascii="Times" w:eastAsia="Times New Roman" w:hAnsi="Times" w:cs="Times New Roman"/>
-          <w:color w:val="000000"/>
-          <w:sz w:val="20"/>
-          <w:szCs w:val="20"/>
-          <w:lang w:val="en-CA"/>
-        </w:rPr>
-      </w:pPr>
-      <w:r>
-        <w:rPr>
-          <w:rFonts w:ascii="Times" w:eastAsia="Times New Roman" w:hAnsi="Times" w:cs="Times New Roman"/>
-          <w:color w:val="000000"/>
-          <w:sz w:val="20"/>
-          <w:szCs w:val="20"/>
-          <w:lang w:val="en-CA"/>
-        </w:rPr>
-        <w:t>https://oceandata.sci.gsfc.nasa.gov/cgi/getfile/C19860011986365.L3m_YR_CHL_chl_ocx_4km.nc</w:t>
-      </w:r>
-    </w:p>
-    <w:p>
-      <w:pPr>
-        <w:rPr>
-          <w:rFonts w:ascii="Times" w:eastAsia="Times New Roman" w:hAnsi="Times" w:cs="Times New Roman"/>
-          <w:color w:val="000000"/>
-          <w:sz w:val="20"/>
-          <w:szCs w:val="20"/>
-          <w:lang w:val="en-CA"/>
-        </w:rPr>
-      </w:pPr>
-    </w:p>
-    <w:p>
-      <w:r>
-        <w:t xml:space="preserve">ANNUAL LINKS: </w:t>
-      </w:r>
       <w:proofErr w:type="spellStart"/>
       <w:r>
         <w:t>SeaWiFS</w:t>
       </w:r>
       <w:proofErr w:type="spellEnd"/>
       <w:r>
-        <w:t xml:space="preserve"> </w:t>
-      </w:r>
-      <w:r>
-        <w:t>1997-2002</w:t>
-      </w:r>
-      <w:bookmarkStart w:id="0" w:name="_GoBack"/>
-      <w:bookmarkEnd w:id="0"/>
+        <w:t xml:space="preserve"> 1997-2002</w:t>
+      </w:r>
     </w:p>
     <w:p>
       <w:pPr>
@@ -2742,22 +2717,40 @@
         </w:rPr>
         <w:t>Entire mission</w:t>
       </w:r>
-    </w:p>
-    <w:p>
-      <w:pPr>
-        <w:rPr>
-          <w:rFonts w:ascii="Times New Roman" w:hAnsi="Times New Roman" w:cs="Times New Roman"/>
-          <w:sz w:val="20"/>
-          <w:szCs w:val="20"/>
-        </w:rPr>
-      </w:pPr>
-      <w:r>
-        <w:rPr>
-          <w:rFonts w:ascii="Times New Roman" w:hAnsi="Times New Roman" w:cs="Times New Roman"/>
-          <w:sz w:val="20"/>
-          <w:szCs w:val="20"/>
-        </w:rPr>
-        <w:t>https://oceandata.sci.gsfc.nasa.gov/cgi/getfile/A20021852021031.L3m_CU_CHL_chlor_a_4km.nc</w:t>
+      <w:r>
+        <w:rPr>
+          <w:rFonts w:ascii="Times New Roman" w:hAnsi="Times New Roman" w:cs="Times New Roman"/>
+          <w:sz w:val="22"/>
+          <w:szCs w:val="22"/>
+        </w:rPr>
+        <w:t>: Modis Aqua</w:t>
+      </w:r>
+    </w:p>
+    <w:p>
+      <w:pPr>
+        <w:rPr>
+          <w:rFonts w:ascii="Times New Roman" w:hAnsi="Times New Roman" w:cs="Times New Roman"/>
+          <w:sz w:val="20"/>
+          <w:szCs w:val="20"/>
+        </w:rPr>
+      </w:pPr>
+      <w:bookmarkStart w:id="0" w:name="_GoBack"/>
+      <w:r>
+        <w:rPr>
+          <w:rFonts w:ascii="Times New Roman" w:hAnsi="Times New Roman" w:cs="Times New Roman"/>
+          <w:sz w:val="20"/>
+          <w:szCs w:val="20"/>
+        </w:rPr>
+        <w:t>https://oceandata.sci.gsfc.nasa.gov/</w:t>
+      </w:r>
+      <w:bookmarkEnd w:id="0"/>
+      <w:r>
+        <w:rPr>
+          <w:rFonts w:ascii="Times New Roman" w:hAnsi="Times New Roman" w:cs="Times New Roman"/>
+          <w:sz w:val="20"/>
+          <w:szCs w:val="20"/>
+        </w:rPr>
+        <w:t>cgi/getfile/A20021852021031.L3m_CU_CHL_chlor_a_4km.nc</w:t>
       </w:r>
     </w:p>
     <w:p>
@@ -3184,6 +3177,7 @@
   <w:style w:type="character" w:default="1" w:styleId="DefaultParagraphFont">
     <w:name w:val="Default Paragraph Font"/>
     <w:uiPriority w:val="1"/>
+    <w:semiHidden/>
     <w:unhideWhenUsed/>
   </w:style>
   <w:style w:type="table" w:default="1" w:styleId="TableNormal">

</xml_diff>